<commit_message>
docs: design separate new-user and activation report flows
Co-authored-by: Ashleymmy <Ashleymmy@users.noreply.github.com>
</commit_message>
<xml_diff>
--- a/改造/报表上传与归因体验优化方案_待审核_2026-10-08.docx
+++ b/改造/报表上传与归因体验优化方案_待审核_2026-10-08.docx
@@ -27,7 +27,7 @@
     </w:p>
     <w:p>
       <w:r>
-        <w:t>关联文档：《平台体验与财务链路改造方案_待审核_2026-10-08》（下称“平台方案”）、《财务与收益链路改造计划_待审核_2026-10-08》（下称“财务方案”）</w:t>
+        <w:t>关联文档：《平台体验与财务链路改造方案_待审核_2026-10-08》（下称“平台方案”）、《财务与收益链路改造计划_待审核_2026-10-08》（下称“财务方案”）、《知乎拉新拉活改造分工与衔接计划》（下称“拉新拉活计划”）</w:t>
       </w:r>
     </w:p>
     <w:p>
@@ -52,7 +52,22 @@
         <w:t>?done</w:t>
       </w:r>
       <w:r>
-        <w:t xml:space="preserve"> 跳过动画）</w:t>
+        <w:t xml:space="preserve"> 跳过动画，加 </w:t>
+      </w:r>
+      <w:r>
+        <w:rPr>
+          <w:rFonts w:ascii="Consolas" w:hAnsi="Consolas"/>
+          <w:sz w:val="19"/>
+        </w:rPr>
+        <w:t>?done&amp;activation</w:t>
+      </w:r>
+      <w:r>
+        <w:t xml:space="preserve"> 查看拉活流程）</w:t>
+      </w:r>
+    </w:p>
+    <w:p>
+      <w:r>
+        <w:t>拉新与拉活两类业绩的设计见第 9 节。</w:t>
       </w:r>
     </w:p>
     <w:p>
@@ -6040,7 +6055,7 @@
         <w:t>表头不确定时问人</w:t>
       </w:r>
       <w:r>
-        <w:t>：给出识别到的表头，让人点选对应列，并记住这份模板，下次同样的表头自动识别。【待核实：V5 真实知乎导出表的表头】</w:t>
+        <w:t>：给出识别到的表头，让人点选对应列，并记住这份模板，下次同样的表头自动识别。知乎官方订单表的表头已与现有解析器核对一致，样例中没有合计行【已核实：2026-09-27 官方样例】；汇总行跳过规则仍保留，用于手工整理过的表格。</w:t>
       </w:r>
     </w:p>
     <w:p>
@@ -7790,6 +7805,3577 @@
                 <w:sz w:val="18"/>
               </w:rPr>
               <w:t>本期不做，保留扩展</w:t>
+            </w:r>
+          </w:p>
+        </w:tc>
+        <w:tc>
+          <w:tcPr>
+            <w:tcW w:type="dxa" w:w="2493"/>
+          </w:tcPr>
+          <w:p>
+            <w:r>
+              <w:rPr>
+                <w:sz w:val="18"/>
+              </w:rPr>
+            </w:r>
+          </w:p>
+        </w:tc>
+      </w:tr>
+    </w:tbl>
+    <w:p/>
+    <w:p>
+      <w:pPr>
+        <w:pStyle w:val="Heading1"/>
+      </w:pPr>
+      <w:r>
+        <w:t>9. 拉新与拉活：两类业绩分开处理</w:t>
+      </w:r>
+    </w:p>
+    <w:p>
+      <w:pPr>
+        <w:pStyle w:val="Heading2"/>
+      </w:pPr>
+      <w:r>
+        <w:t>9.1 结论</w:t>
+      </w:r>
+    </w:p>
+    <w:p>
+      <w:r>
+        <w:t>同意“上传前先选拉新还是拉活，再进入对应的分析流程”。这样拉活上线时，已经在跑的拉新流程完全不用动。在此基础上补充三点：</w:t>
+      </w:r>
+    </w:p>
+    <w:p>
+      <w:pPr>
+        <w:pStyle w:val="ListNumber"/>
+      </w:pPr>
+      <w:r>
+        <w:rPr>
+          <w:b/>
+        </w:rPr>
+        <w:t>选择之后，系统再按表头核对一次。</w:t>
+      </w:r>
+      <w:r>
+        <w:t xml:space="preserve"> 选了拉新、文件里却是“拉活量”，就在第 1 步提示“这份看起来是拉活表，按拉活处理？”，不会悄悄按错误的类型处理。</w:t>
+      </w:r>
+    </w:p>
+    <w:p>
+      <w:pPr>
+        <w:pStyle w:val="ListNumber"/>
+      </w:pPr>
+      <w:r>
+        <w:rPr>
+          <w:b/>
+        </w:rPr>
+        <w:t>数据按类型分开存储，这才是“不影响拉新”的真正保障。</w:t>
+      </w:r>
+      <w:r>
+        <w:t xml:space="preserve"> 入口选项只是第一道防线；存储层给每条业绩加一个“业绩类型”，拉活的上传、更正、重算、确认永远碰不到拉新的数据和已确认的账。</w:t>
+      </w:r>
+    </w:p>
+    <w:p>
+      <w:pPr>
+        <w:pStyle w:val="ListNumber"/>
+      </w:pPr>
+      <w:r>
+        <w:rPr>
+          <w:b/>
+        </w:rPr>
+        <w:t>两条流程共用一套页面和归属逻辑，只在“读取文件、核对结算金额、计算金额”三处不同。</w:t>
+      </w:r>
+      <w:r>
+        <w:t xml:space="preserve"> 不复制一套页面和引擎，否则以后每个改进都要做两遍。</w:t>
+      </w:r>
+    </w:p>
+    <w:p>
+      <w:pPr>
+        <w:pStyle w:val="Heading2"/>
+      </w:pPr>
+      <w:r>
+        <w:t>9.2 样例核对</w:t>
+      </w:r>
+    </w:p>
+    <w:tbl>
+      <w:tblPr>
+        <w:tblStyle w:val="TableGrid"/>
+        <w:tblW w:type="auto" w:w="0"/>
+        <w:jc w:val="center"/>
+        <w:tblLook w:firstColumn="1" w:firstRow="1" w:lastColumn="0" w:lastRow="0" w:noHBand="0" w:noVBand="1" w:val="04A0"/>
+      </w:tblPr>
+      <w:tblGrid>
+        <w:gridCol w:w="3324"/>
+        <w:gridCol w:w="3324"/>
+        <w:gridCol w:w="3324"/>
+      </w:tblGrid>
+      <w:tr>
+        <w:tc>
+          <w:tcPr>
+            <w:tcW w:type="dxa" w:w="3324"/>
+          </w:tcPr>
+          <w:p>
+            <w:r>
+              <w:rPr>
+                <w:b/>
+                <w:sz w:val="18"/>
+              </w:rPr>
+            </w:r>
+            <w:r>
+              <w:rPr>
+                <w:b/>
+                <w:sz w:val="18"/>
+              </w:rPr>
+              <w:t>文件</w:t>
+            </w:r>
+          </w:p>
+        </w:tc>
+        <w:tc>
+          <w:tcPr>
+            <w:tcW w:type="dxa" w:w="3324"/>
+          </w:tcPr>
+          <w:p>
+            <w:r>
+              <w:rPr>
+                <w:b/>
+                <w:sz w:val="18"/>
+              </w:rPr>
+            </w:r>
+            <w:r>
+              <w:rPr>
+                <w:b/>
+                <w:sz w:val="18"/>
+              </w:rPr>
+              <w:t>表头</w:t>
+            </w:r>
+          </w:p>
+        </w:tc>
+        <w:tc>
+          <w:tcPr>
+            <w:tcW w:type="dxa" w:w="3324"/>
+          </w:tcPr>
+          <w:p>
+            <w:r>
+              <w:rPr>
+                <w:b/>
+                <w:sz w:val="18"/>
+              </w:rPr>
+            </w:r>
+            <w:r>
+              <w:rPr>
+                <w:b/>
+                <w:sz w:val="18"/>
+              </w:rPr>
+              <w:t>现有系统处理结果</w:t>
+            </w:r>
+          </w:p>
+        </w:tc>
+      </w:tr>
+      <w:tr>
+        <w:tc>
+          <w:tcPr>
+            <w:tcW w:type="dxa" w:w="3324"/>
+          </w:tcPr>
+          <w:p>
+            <w:r>
+              <w:rPr>
+                <w:sz w:val="18"/>
+              </w:rPr>
+            </w:r>
+            <w:r>
+              <w:rPr>
+                <w:sz w:val="18"/>
+              </w:rPr>
+              <w:t>知乎官方订单表（</w:t>
+            </w:r>
+            <w:r>
+              <w:rPr>
+                <w:rFonts w:ascii="Consolas" w:hAnsi="Consolas"/>
+                <w:sz w:val="18"/>
+              </w:rPr>
+              <w:t>知乎_OrderData_…_20260927.xlsx</w:t>
+            </w:r>
+            <w:r>
+              <w:rPr>
+                <w:sz w:val="18"/>
+              </w:rPr>
+              <w:t>）</w:t>
+            </w:r>
+          </w:p>
+        </w:tc>
+        <w:tc>
+          <w:tcPr>
+            <w:tcW w:type="dxa" w:w="3324"/>
+          </w:tcPr>
+          <w:p>
+            <w:r>
+              <w:rPr>
+                <w:sz w:val="18"/>
+              </w:rPr>
+            </w:r>
+            <w:r>
+              <w:rPr>
+                <w:sz w:val="18"/>
+              </w:rPr>
+              <w:t>日期时间、渠道名称、关键词、推广任务、风险判定、搜索量、订单量、搜索转化率（单位%）</w:t>
+            </w:r>
+          </w:p>
+        </w:tc>
+        <w:tc>
+          <w:tcPr>
+            <w:tcW w:type="dxa" w:w="3324"/>
+          </w:tcPr>
+          <w:p>
+            <w:r>
+              <w:rPr>
+                <w:sz w:val="18"/>
+              </w:rPr>
+            </w:r>
+            <w:r>
+              <w:rPr>
+                <w:sz w:val="18"/>
+              </w:rPr>
+              <w:t>解析正常；推广任务为“KOC-会员订单”；没有合计行【已核实】</w:t>
+            </w:r>
+          </w:p>
+        </w:tc>
+      </w:tr>
+      <w:tr>
+        <w:tc>
+          <w:tcPr>
+            <w:tcW w:type="dxa" w:w="3324"/>
+          </w:tcPr>
+          <w:p>
+            <w:r>
+              <w:rPr>
+                <w:sz w:val="18"/>
+              </w:rPr>
+            </w:r>
+            <w:r>
+              <w:rPr>
+                <w:sz w:val="18"/>
+              </w:rPr>
+              <w:t>拉活补贴表（目前只有截图，按截图表头模拟）</w:t>
+            </w:r>
+          </w:p>
+        </w:tc>
+        <w:tc>
+          <w:tcPr>
+            <w:tcW w:type="dxa" w:w="3324"/>
+          </w:tcPr>
+          <w:p>
+            <w:r>
+              <w:rPr>
+                <w:sz w:val="18"/>
+              </w:rPr>
+            </w:r>
+            <w:r>
+              <w:rPr>
+                <w:sz w:val="18"/>
+              </w:rPr>
+              <w:t>日期、代理名称、渠道名称、关键词、结算金额、拉活量</w:t>
+            </w:r>
+          </w:p>
+        </w:tc>
+        <w:tc>
+          <w:tcPr>
+            <w:tcW w:type="dxa" w:w="3324"/>
+          </w:tcPr>
+          <w:p>
+            <w:r>
+              <w:rPr>
+                <w:sz w:val="18"/>
+              </w:rPr>
+            </w:r>
+            <w:r>
+              <w:rPr>
+                <w:b/>
+                <w:sz w:val="18"/>
+              </w:rPr>
+              <w:t>整份拒收</w:t>
+            </w:r>
+            <w:r>
+              <w:rPr>
+                <w:sz w:val="18"/>
+              </w:rPr>
+              <w:t>：三种报表类型都报“报告类型与指标列不一致”，拉活目前无法上传【已核实：按截图表头模拟】</w:t>
+            </w:r>
+          </w:p>
+        </w:tc>
+      </w:tr>
+    </w:tbl>
+    <w:p/>
+    <w:p>
+      <w:r>
+        <w:t xml:space="preserve">两份样例的渠道都是“渡川-知星河”，所以拉活可以直接沿用现有的渠道对应关系和关键词归属。拉活表的日期格式是 </w:t>
+      </w:r>
+      <w:r>
+        <w:rPr>
+          <w:rFonts w:ascii="Consolas" w:hAnsi="Consolas"/>
+          <w:sz w:val="19"/>
+        </w:rPr>
+        <w:t>2026/9/14</w:t>
+      </w:r>
+      <w:r>
+        <w:t>，解析器需要支持这种写法。真实拉活源文件拿到后需要再核对一次表头和日期格式【待核实】。</w:t>
+      </w:r>
+    </w:p>
+    <w:p>
+      <w:pPr>
+        <w:pStyle w:val="Heading2"/>
+      </w:pPr>
+      <w:r>
+        <w:t>9.3 入口交互</w:t>
+      </w:r>
+    </w:p>
+    <w:p>
+      <w:r>
+        <w:drawing>
+          <wp:inline xmlns:a="http://schemas.openxmlformats.org/drawingml/2006/main" xmlns:pic="http://schemas.openxmlformats.org/drawingml/2006/picture">
+            <wp:extent cx="5760000" cy="4000000"/>
+            <wp:docPr id="4" name="Picture 4"/>
+            <wp:cNvGraphicFramePr>
+              <a:graphicFrameLocks noChangeAspect="1"/>
+            </wp:cNvGraphicFramePr>
+            <a:graphic>
+              <a:graphicData uri="http://schemas.openxmlformats.org/drawingml/2006/picture">
+                <pic:pic>
+                  <pic:nvPicPr>
+                    <pic:cNvPr id="0" name="14-原型-拉活流程.png"/>
+                    <pic:cNvPicPr/>
+                  </pic:nvPicPr>
+                  <pic:blipFill>
+                    <a:blip r:embed="rId12"/>
+                    <a:stretch>
+                      <a:fillRect/>
+                    </a:stretch>
+                  </pic:blipFill>
+                  <pic:spPr>
+                    <a:xfrm>
+                      <a:off x="0" y="0"/>
+                      <a:ext cx="5760000" cy="4000000"/>
+                    </a:xfrm>
+                    <a:prstGeom prst="rect"/>
+                  </pic:spPr>
+                </pic:pic>
+              </a:graphicData>
+            </a:graphic>
+          </wp:inline>
+        </w:drawing>
+      </w:r>
+    </w:p>
+    <w:p>
+      <w:r>
+        <w:rPr>
+          <w:i/>
+        </w:rPr>
+        <w:t>拉活流程</w:t>
+      </w:r>
+    </w:p>
+    <w:p>
+      <w:pPr>
+        <w:pStyle w:val="ListBullet"/>
+      </w:pPr>
+      <w:r>
+        <w:t>上传区上方是两张选择卡片：</w:t>
+      </w:r>
+    </w:p>
+    <w:p>
+      <w:pPr>
+        <w:pStyle w:val="ListBullet2"/>
+      </w:pPr>
+      <w:r>
+        <w:rPr>
+          <w:b/>
+        </w:rPr>
+        <w:t>拉新订单</w:t>
+      </w:r>
+      <w:r>
+        <w:t>：知乎邮件里的订单报表，看“订单量”。</w:t>
+      </w:r>
+    </w:p>
+    <w:p>
+      <w:pPr>
+        <w:pStyle w:val="ListBullet2"/>
+      </w:pPr>
+      <w:r>
+        <w:rPr>
+          <w:b/>
+        </w:rPr>
+        <w:t>拉活</w:t>
+      </w:r>
+      <w:r>
+        <w:t>：拉活补贴表，看“拉活量”。</w:t>
+      </w:r>
+    </w:p>
+    <w:p>
+      <w:pPr>
+        <w:pStyle w:val="ListBullet"/>
+      </w:pPr>
+      <w:r>
+        <w:t>默认选中上次用过的类型。</w:t>
+      </w:r>
+    </w:p>
+    <w:p>
+      <w:pPr>
+        <w:pStyle w:val="ListBullet"/>
+      </w:pPr>
+      <w:r>
+        <w:t>选择后上传文件；第 1 步“读取文件”下方显示“已按表头核对：有‘拉活量’‘结算金额’列，是拉活表”。</w:t>
+      </w:r>
+    </w:p>
+    <w:p>
+      <w:pPr>
+        <w:pStyle w:val="ListBullet"/>
+      </w:pPr>
+      <w:r>
+        <w:t>选择和表头对不上时，问一句“这份文件有‘拉活量’列，看起来是拉活表。按拉活处理？”，选项为【按拉活处理】【重新选择文件】。对不上的类型不能强行处理，因为缺少对应的数量列。</w:t>
+      </w:r>
+    </w:p>
+    <w:p>
+      <w:pPr>
+        <w:pStyle w:val="ListBullet"/>
+      </w:pPr>
+      <w:r>
+        <w:t>结果表、财务总览、我的收益都带“业绩类型”筛选和标签；数量单位拉新用“单”，拉活用“个”。</w:t>
+      </w:r>
+    </w:p>
+    <w:p>
+      <w:pPr>
+        <w:pStyle w:val="Heading2"/>
+      </w:pPr>
+      <w:r>
+        <w:t>9.4 两条流程的差别</w:t>
+      </w:r>
+    </w:p>
+    <w:tbl>
+      <w:tblPr>
+        <w:tblStyle w:val="TableGrid"/>
+        <w:tblW w:type="auto" w:w="0"/>
+        <w:jc w:val="center"/>
+        <w:tblLook w:firstColumn="1" w:firstRow="1" w:lastColumn="0" w:lastRow="0" w:noHBand="0" w:noVBand="1" w:val="04A0"/>
+      </w:tblPr>
+      <w:tblGrid>
+        <w:gridCol w:w="3324"/>
+        <w:gridCol w:w="3324"/>
+        <w:gridCol w:w="3324"/>
+      </w:tblGrid>
+      <w:tr>
+        <w:tc>
+          <w:tcPr>
+            <w:tcW w:type="dxa" w:w="3324"/>
+          </w:tcPr>
+          <w:p>
+            <w:r>
+              <w:rPr>
+                <w:b/>
+                <w:sz w:val="18"/>
+              </w:rPr>
+            </w:r>
+            <w:r>
+              <w:rPr>
+                <w:b/>
+                <w:sz w:val="18"/>
+              </w:rPr>
+              <w:t>步骤</w:t>
+            </w:r>
+          </w:p>
+        </w:tc>
+        <w:tc>
+          <w:tcPr>
+            <w:tcW w:type="dxa" w:w="3324"/>
+          </w:tcPr>
+          <w:p>
+            <w:r>
+              <w:rPr>
+                <w:b/>
+                <w:sz w:val="18"/>
+              </w:rPr>
+            </w:r>
+            <w:r>
+              <w:rPr>
+                <w:b/>
+                <w:sz w:val="18"/>
+              </w:rPr>
+              <w:t>拉新订单</w:t>
+            </w:r>
+          </w:p>
+        </w:tc>
+        <w:tc>
+          <w:tcPr>
+            <w:tcW w:type="dxa" w:w="3324"/>
+          </w:tcPr>
+          <w:p>
+            <w:r>
+              <w:rPr>
+                <w:b/>
+                <w:sz w:val="18"/>
+              </w:rPr>
+            </w:r>
+            <w:r>
+              <w:rPr>
+                <w:b/>
+                <w:sz w:val="18"/>
+              </w:rPr>
+              <w:t>拉活</w:t>
+            </w:r>
+          </w:p>
+        </w:tc>
+      </w:tr>
+      <w:tr>
+        <w:tc>
+          <w:tcPr>
+            <w:tcW w:type="dxa" w:w="3324"/>
+          </w:tcPr>
+          <w:p>
+            <w:r>
+              <w:rPr>
+                <w:sz w:val="18"/>
+              </w:rPr>
+            </w:r>
+            <w:r>
+              <w:rPr>
+                <w:sz w:val="18"/>
+              </w:rPr>
+              <w:t>读取文件</w:t>
+            </w:r>
+          </w:p>
+        </w:tc>
+        <w:tc>
+          <w:tcPr>
+            <w:tcW w:type="dxa" w:w="3324"/>
+          </w:tcPr>
+          <w:p>
+            <w:r>
+              <w:rPr>
+                <w:sz w:val="18"/>
+              </w:rPr>
+            </w:r>
+            <w:r>
+              <w:rPr>
+                <w:sz w:val="18"/>
+              </w:rPr>
+              <w:t>订单量、搜索量、风险判定、推广任务</w:t>
+            </w:r>
+          </w:p>
+        </w:tc>
+        <w:tc>
+          <w:tcPr>
+            <w:tcW w:type="dxa" w:w="3324"/>
+          </w:tcPr>
+          <w:p>
+            <w:r>
+              <w:rPr>
+                <w:sz w:val="18"/>
+              </w:rPr>
+            </w:r>
+            <w:r>
+              <w:rPr>
+                <w:sz w:val="18"/>
+              </w:rPr>
+              <w:t>拉活量、结算金额、代理名称</w:t>
+            </w:r>
+          </w:p>
+        </w:tc>
+      </w:tr>
+      <w:tr>
+        <w:tc>
+          <w:tcPr>
+            <w:tcW w:type="dxa" w:w="3324"/>
+          </w:tcPr>
+          <w:p>
+            <w:r>
+              <w:rPr>
+                <w:sz w:val="18"/>
+              </w:rPr>
+            </w:r>
+            <w:r>
+              <w:rPr>
+                <w:sz w:val="18"/>
+              </w:rPr>
+              <w:t>核对渠道</w:t>
+            </w:r>
+          </w:p>
+        </w:tc>
+        <w:tc>
+          <w:tcPr>
+            <w:tcW w:type="dxa" w:w="3324"/>
+          </w:tcPr>
+          <w:p>
+            <w:r>
+              <w:rPr>
+                <w:sz w:val="18"/>
+              </w:rPr>
+            </w:r>
+            <w:r>
+              <w:rPr>
+                <w:sz w:val="18"/>
+              </w:rPr>
+              <w:t>相同</w:t>
+            </w:r>
+          </w:p>
+        </w:tc>
+        <w:tc>
+          <w:tcPr>
+            <w:tcW w:type="dxa" w:w="3324"/>
+          </w:tcPr>
+          <w:p>
+            <w:r>
+              <w:rPr>
+                <w:sz w:val="18"/>
+              </w:rPr>
+            </w:r>
+            <w:r>
+              <w:rPr>
+                <w:sz w:val="18"/>
+              </w:rPr>
+              <w:t>相同</w:t>
+            </w:r>
+          </w:p>
+        </w:tc>
+      </w:tr>
+      <w:tr>
+        <w:tc>
+          <w:tcPr>
+            <w:tcW w:type="dxa" w:w="3324"/>
+          </w:tcPr>
+          <w:p>
+            <w:r>
+              <w:rPr>
+                <w:sz w:val="18"/>
+              </w:rPr>
+            </w:r>
+            <w:r>
+              <w:rPr>
+                <w:sz w:val="18"/>
+              </w:rPr>
+              <w:t>匹配关键词</w:t>
+            </w:r>
+          </w:p>
+        </w:tc>
+        <w:tc>
+          <w:tcPr>
+            <w:tcW w:type="dxa" w:w="3324"/>
+          </w:tcPr>
+          <w:p>
+            <w:r>
+              <w:rPr>
+                <w:sz w:val="18"/>
+              </w:rPr>
+            </w:r>
+            <w:r>
+              <w:rPr>
+                <w:sz w:val="18"/>
+              </w:rPr>
+              <w:t>相同</w:t>
+            </w:r>
+          </w:p>
+        </w:tc>
+        <w:tc>
+          <w:tcPr>
+            <w:tcW w:type="dxa" w:w="3324"/>
+          </w:tcPr>
+          <w:p>
+            <w:r>
+              <w:rPr>
+                <w:sz w:val="18"/>
+              </w:rPr>
+            </w:r>
+            <w:r>
+              <w:rPr>
+                <w:sz w:val="18"/>
+              </w:rPr>
+              <w:t>相同</w:t>
+            </w:r>
+          </w:p>
+        </w:tc>
+      </w:tr>
+      <w:tr>
+        <w:tc>
+          <w:tcPr>
+            <w:tcW w:type="dxa" w:w="3324"/>
+          </w:tcPr>
+          <w:p>
+            <w:r>
+              <w:rPr>
+                <w:sz w:val="18"/>
+              </w:rPr>
+            </w:r>
+            <w:r>
+              <w:rPr>
+                <w:sz w:val="18"/>
+              </w:rPr>
+              <w:t>识别执行人</w:t>
+            </w:r>
+          </w:p>
+        </w:tc>
+        <w:tc>
+          <w:tcPr>
+            <w:tcW w:type="dxa" w:w="3324"/>
+          </w:tcPr>
+          <w:p>
+            <w:r>
+              <w:rPr>
+                <w:sz w:val="18"/>
+              </w:rPr>
+            </w:r>
+            <w:r>
+              <w:rPr>
+                <w:sz w:val="18"/>
+              </w:rPr>
+              <w:t>相同（关键词唯一归属）</w:t>
+            </w:r>
+          </w:p>
+        </w:tc>
+        <w:tc>
+          <w:tcPr>
+            <w:tcW w:type="dxa" w:w="3324"/>
+          </w:tcPr>
+          <w:p>
+            <w:r>
+              <w:rPr>
+                <w:sz w:val="18"/>
+              </w:rPr>
+            </w:r>
+            <w:r>
+              <w:rPr>
+                <w:sz w:val="18"/>
+              </w:rPr>
+              <w:t>相同</w:t>
+            </w:r>
+          </w:p>
+        </w:tc>
+      </w:tr>
+      <w:tr>
+        <w:tc>
+          <w:tcPr>
+            <w:tcW w:type="dxa" w:w="3324"/>
+          </w:tcPr>
+          <w:p>
+            <w:r>
+              <w:rPr>
+                <w:sz w:val="18"/>
+              </w:rPr>
+            </w:r>
+            <w:r>
+              <w:rPr>
+                <w:sz w:val="18"/>
+              </w:rPr>
+              <w:t>核对作品</w:t>
+            </w:r>
+          </w:p>
+        </w:tc>
+        <w:tc>
+          <w:tcPr>
+            <w:tcW w:type="dxa" w:w="3324"/>
+          </w:tcPr>
+          <w:p>
+            <w:r>
+              <w:rPr>
+                <w:sz w:val="18"/>
+              </w:rPr>
+            </w:r>
+            <w:r>
+              <w:rPr>
+                <w:sz w:val="18"/>
+              </w:rPr>
+              <w:t>相同</w:t>
+            </w:r>
+          </w:p>
+        </w:tc>
+        <w:tc>
+          <w:tcPr>
+            <w:tcW w:type="dxa" w:w="3324"/>
+          </w:tcPr>
+          <w:p>
+            <w:r>
+              <w:rPr>
+                <w:sz w:val="18"/>
+              </w:rPr>
+            </w:r>
+            <w:r>
+              <w:rPr>
+                <w:sz w:val="18"/>
+              </w:rPr>
+              <w:t>相同【待确认：C6，拉活是否也要求作品核验通过才能确认】</w:t>
+            </w:r>
+          </w:p>
+        </w:tc>
+      </w:tr>
+      <w:tr>
+        <w:tc>
+          <w:tcPr>
+            <w:tcW w:type="dxa" w:w="3324"/>
+          </w:tcPr>
+          <w:p>
+            <w:r>
+              <w:rPr>
+                <w:sz w:val="18"/>
+              </w:rPr>
+            </w:r>
+            <w:r>
+              <w:rPr>
+                <w:sz w:val="18"/>
+              </w:rPr>
+              <w:t>拉活独有：核对结算金额</w:t>
+            </w:r>
+          </w:p>
+        </w:tc>
+        <w:tc>
+          <w:tcPr>
+            <w:tcW w:type="dxa" w:w="3324"/>
+          </w:tcPr>
+          <w:p>
+            <w:r>
+              <w:rPr>
+                <w:sz w:val="18"/>
+              </w:rPr>
+            </w:r>
+            <w:r>
+              <w:rPr>
+                <w:sz w:val="18"/>
+              </w:rPr>
+              <w:t>—</w:t>
+            </w:r>
+          </w:p>
+        </w:tc>
+        <w:tc>
+          <w:tcPr>
+            <w:tcW w:type="dxa" w:w="3324"/>
+          </w:tcPr>
+          <w:p>
+            <w:r>
+              <w:rPr>
+                <w:sz w:val="18"/>
+              </w:rPr>
+            </w:r>
+            <w:r>
+              <w:rPr>
+                <w:sz w:val="18"/>
+              </w:rPr>
+              <w:t>检查“结算金额 = 拉活量 × 上游单价（2.00 元）”；不一致的行标为“结算金额对不上”，由财务决定按哪个算</w:t>
+            </w:r>
+          </w:p>
+        </w:tc>
+      </w:tr>
+      <w:tr>
+        <w:tc>
+          <w:tcPr>
+            <w:tcW w:type="dxa" w:w="3324"/>
+          </w:tcPr>
+          <w:p>
+            <w:r>
+              <w:rPr>
+                <w:sz w:val="18"/>
+              </w:rPr>
+            </w:r>
+            <w:r>
+              <w:rPr>
+                <w:sz w:val="18"/>
+              </w:rPr>
+              <w:t>拉活独有：核对代理名称</w:t>
+            </w:r>
+          </w:p>
+        </w:tc>
+        <w:tc>
+          <w:tcPr>
+            <w:tcW w:type="dxa" w:w="3324"/>
+          </w:tcPr>
+          <w:p>
+            <w:r>
+              <w:rPr>
+                <w:sz w:val="18"/>
+              </w:rPr>
+            </w:r>
+            <w:r>
+              <w:rPr>
+                <w:sz w:val="18"/>
+              </w:rPr>
+              <w:t>—</w:t>
+            </w:r>
+          </w:p>
+        </w:tc>
+        <w:tc>
+          <w:tcPr>
+            <w:tcW w:type="dxa" w:w="3324"/>
+          </w:tcPr>
+          <w:p>
+            <w:r>
+              <w:rPr>
+                <w:sz w:val="18"/>
+              </w:rPr>
+            </w:r>
+            <w:r>
+              <w:rPr>
+                <w:sz w:val="18"/>
+              </w:rPr>
+              <w:t>代理名称和项目登记的代理不一致时提示（例如不是“广州渡川”）</w:t>
+            </w:r>
+          </w:p>
+        </w:tc>
+      </w:tr>
+      <w:tr>
+        <w:tc>
+          <w:tcPr>
+            <w:tcW w:type="dxa" w:w="3324"/>
+          </w:tcPr>
+          <w:p>
+            <w:r>
+              <w:rPr>
+                <w:sz w:val="18"/>
+              </w:rPr>
+            </w:r>
+            <w:r>
+              <w:rPr>
+                <w:sz w:val="18"/>
+              </w:rPr>
+              <w:t>计算金额</w:t>
+            </w:r>
+          </w:p>
+        </w:tc>
+        <w:tc>
+          <w:tcPr>
+            <w:tcW w:type="dxa" w:w="3324"/>
+          </w:tcPr>
+          <w:p>
+            <w:r>
+              <w:rPr>
+                <w:sz w:val="18"/>
+              </w:rPr>
+            </w:r>
+            <w:r>
+              <w:rPr>
+                <w:sz w:val="18"/>
+              </w:rPr>
+              <w:t>拉新单价</w:t>
+            </w:r>
+          </w:p>
+        </w:tc>
+        <w:tc>
+          <w:tcPr>
+            <w:tcW w:type="dxa" w:w="3324"/>
+          </w:tcPr>
+          <w:p>
+            <w:r>
+              <w:rPr>
+                <w:sz w:val="18"/>
+              </w:rPr>
+            </w:r>
+            <w:r>
+              <w:rPr>
+                <w:sz w:val="18"/>
+              </w:rPr>
+              <w:t>拉活单价</w:t>
+            </w:r>
+          </w:p>
+        </w:tc>
+      </w:tr>
+    </w:tbl>
+    <w:p/>
+    <w:p>
+      <w:pPr>
+        <w:pStyle w:val="Heading2"/>
+      </w:pPr>
+      <w:r>
+        <w:t>9.5 单价</w:t>
+      </w:r>
+    </w:p>
+    <w:p>
+      <w:r>
+        <w:t>两组单价沿用拉新拉活计划中已确认的分类，并按平台方案的角色单价结构表达：</w:t>
+      </w:r>
+    </w:p>
+    <w:tbl>
+      <w:tblPr>
+        <w:tblStyle w:val="TableGrid"/>
+        <w:tblW w:type="auto" w:w="0"/>
+        <w:jc w:val="center"/>
+        <w:tblLook w:firstColumn="1" w:firstRow="1" w:lastColumn="0" w:lastRow="0" w:noHBand="0" w:noVBand="1" w:val="04A0"/>
+      </w:tblPr>
+      <w:tblGrid>
+        <w:gridCol w:w="3324"/>
+        <w:gridCol w:w="3324"/>
+        <w:gridCol w:w="3324"/>
+      </w:tblGrid>
+      <w:tr>
+        <w:tc>
+          <w:tcPr>
+            <w:tcW w:type="dxa" w:w="3324"/>
+          </w:tcPr>
+          <w:p>
+            <w:r>
+              <w:rPr>
+                <w:b/>
+                <w:sz w:val="18"/>
+              </w:rPr>
+            </w:r>
+            <w:r>
+              <w:rPr>
+                <w:b/>
+                <w:sz w:val="18"/>
+              </w:rPr>
+              <w:t>规则</w:t>
+            </w:r>
+          </w:p>
+        </w:tc>
+        <w:tc>
+          <w:tcPr>
+            <w:tcW w:type="dxa" w:w="3324"/>
+          </w:tcPr>
+          <w:p>
+            <w:r>
+              <w:rPr>
+                <w:b/>
+                <w:sz w:val="18"/>
+              </w:rPr>
+            </w:r>
+            <w:r>
+              <w:rPr>
+                <w:b/>
+                <w:sz w:val="18"/>
+              </w:rPr>
+              <w:t>拉新（元 / 单）</w:t>
+            </w:r>
+          </w:p>
+        </w:tc>
+        <w:tc>
+          <w:tcPr>
+            <w:tcW w:type="dxa" w:w="3324"/>
+          </w:tcPr>
+          <w:p>
+            <w:r>
+              <w:rPr>
+                <w:b/>
+                <w:sz w:val="18"/>
+              </w:rPr>
+            </w:r>
+            <w:r>
+              <w:rPr>
+                <w:b/>
+                <w:sz w:val="18"/>
+              </w:rPr>
+              <w:t>拉活（元 / 个）</w:t>
+            </w:r>
+          </w:p>
+        </w:tc>
+      </w:tr>
+      <w:tr>
+        <w:tc>
+          <w:tcPr>
+            <w:tcW w:type="dxa" w:w="3324"/>
+          </w:tcPr>
+          <w:p>
+            <w:r>
+              <w:rPr>
+                <w:sz w:val="18"/>
+              </w:rPr>
+            </w:r>
+            <w:r>
+              <w:rPr>
+                <w:sz w:val="18"/>
+              </w:rPr>
+              <w:t>管理员本人执行</w:t>
+            </w:r>
+          </w:p>
+        </w:tc>
+        <w:tc>
+          <w:tcPr>
+            <w:tcW w:type="dxa" w:w="3324"/>
+          </w:tcPr>
+          <w:p>
+            <w:r>
+              <w:rPr>
+                <w:sz w:val="18"/>
+              </w:rPr>
+            </w:r>
+            <w:r>
+              <w:rPr>
+                <w:sz w:val="18"/>
+              </w:rPr>
+              <w:t>10.00</w:t>
+            </w:r>
+          </w:p>
+        </w:tc>
+        <w:tc>
+          <w:tcPr>
+            <w:tcW w:type="dxa" w:w="3324"/>
+          </w:tcPr>
+          <w:p>
+            <w:r>
+              <w:rPr>
+                <w:sz w:val="18"/>
+              </w:rPr>
+            </w:r>
+            <w:r>
+              <w:rPr>
+                <w:sz w:val="18"/>
+              </w:rPr>
+              <w:t>2.00【待确认：C3】</w:t>
+            </w:r>
+          </w:p>
+        </w:tc>
+      </w:tr>
+      <w:tr>
+        <w:tc>
+          <w:tcPr>
+            <w:tcW w:type="dxa" w:w="3324"/>
+          </w:tcPr>
+          <w:p>
+            <w:r>
+              <w:rPr>
+                <w:sz w:val="18"/>
+              </w:rPr>
+            </w:r>
+            <w:r>
+              <w:rPr>
+                <w:sz w:val="18"/>
+              </w:rPr>
+              <w:t>团长本人执行</w:t>
+            </w:r>
+          </w:p>
+        </w:tc>
+        <w:tc>
+          <w:tcPr>
+            <w:tcW w:type="dxa" w:w="3324"/>
+          </w:tcPr>
+          <w:p>
+            <w:r>
+              <w:rPr>
+                <w:sz w:val="18"/>
+              </w:rPr>
+            </w:r>
+            <w:r>
+              <w:rPr>
+                <w:sz w:val="18"/>
+              </w:rPr>
+              <w:t>8.50</w:t>
+            </w:r>
+          </w:p>
+        </w:tc>
+        <w:tc>
+          <w:tcPr>
+            <w:tcW w:type="dxa" w:w="3324"/>
+          </w:tcPr>
+          <w:p>
+            <w:r>
+              <w:rPr>
+                <w:sz w:val="18"/>
+              </w:rPr>
+            </w:r>
+            <w:r>
+              <w:rPr>
+                <w:sz w:val="18"/>
+              </w:rPr>
+              <w:t>1.60</w:t>
+            </w:r>
+          </w:p>
+        </w:tc>
+      </w:tr>
+      <w:tr>
+        <w:tc>
+          <w:tcPr>
+            <w:tcW w:type="dxa" w:w="3324"/>
+          </w:tcPr>
+          <w:p>
+            <w:r>
+              <w:rPr>
+                <w:sz w:val="18"/>
+              </w:rPr>
+            </w:r>
+            <w:r>
+              <w:rPr>
+                <w:sz w:val="18"/>
+              </w:rPr>
+              <w:t>团队达人</w:t>
+            </w:r>
+          </w:p>
+        </w:tc>
+        <w:tc>
+          <w:tcPr>
+            <w:tcW w:type="dxa" w:w="3324"/>
+          </w:tcPr>
+          <w:p>
+            <w:r>
+              <w:rPr>
+                <w:sz w:val="18"/>
+              </w:rPr>
+            </w:r>
+            <w:r>
+              <w:rPr>
+                <w:sz w:val="18"/>
+              </w:rPr>
+              <w:t>8.00</w:t>
+            </w:r>
+          </w:p>
+        </w:tc>
+        <w:tc>
+          <w:tcPr>
+            <w:tcW w:type="dxa" w:w="3324"/>
+          </w:tcPr>
+          <w:p>
+            <w:r>
+              <w:rPr>
+                <w:sz w:val="18"/>
+              </w:rPr>
+            </w:r>
+            <w:r>
+              <w:rPr>
+                <w:sz w:val="18"/>
+              </w:rPr>
+              <w:t>1.20</w:t>
+            </w:r>
+          </w:p>
+        </w:tc>
+      </w:tr>
+      <w:tr>
+        <w:tc>
+          <w:tcPr>
+            <w:tcW w:type="dxa" w:w="3324"/>
+          </w:tcPr>
+          <w:p>
+            <w:r>
+              <w:rPr>
+                <w:sz w:val="18"/>
+              </w:rPr>
+            </w:r>
+            <w:r>
+              <w:rPr>
+                <w:sz w:val="18"/>
+              </w:rPr>
+              <w:t>团长分成（团队达人带来的）</w:t>
+            </w:r>
+          </w:p>
+        </w:tc>
+        <w:tc>
+          <w:tcPr>
+            <w:tcW w:type="dxa" w:w="3324"/>
+          </w:tcPr>
+          <w:p>
+            <w:r>
+              <w:rPr>
+                <w:sz w:val="18"/>
+              </w:rPr>
+            </w:r>
+            <w:r>
+              <w:rPr>
+                <w:sz w:val="18"/>
+              </w:rPr>
+              <w:t>0.50</w:t>
+            </w:r>
+          </w:p>
+        </w:tc>
+        <w:tc>
+          <w:tcPr>
+            <w:tcW w:type="dxa" w:w="3324"/>
+          </w:tcPr>
+          <w:p>
+            <w:r>
+              <w:rPr>
+                <w:sz w:val="18"/>
+              </w:rPr>
+            </w:r>
+            <w:r>
+              <w:rPr>
+                <w:sz w:val="18"/>
+              </w:rPr>
+              <w:t>0.40</w:t>
+            </w:r>
+          </w:p>
+        </w:tc>
+      </w:tr>
+      <w:tr>
+        <w:tc>
+          <w:tcPr>
+            <w:tcW w:type="dxa" w:w="3324"/>
+          </w:tcPr>
+          <w:p>
+            <w:r>
+              <w:rPr>
+                <w:sz w:val="18"/>
+              </w:rPr>
+            </w:r>
+            <w:r>
+              <w:rPr>
+                <w:sz w:val="18"/>
+              </w:rPr>
+              <w:t>独立达人</w:t>
+            </w:r>
+          </w:p>
+        </w:tc>
+        <w:tc>
+          <w:tcPr>
+            <w:tcW w:type="dxa" w:w="3324"/>
+          </w:tcPr>
+          <w:p>
+            <w:r>
+              <w:rPr>
+                <w:sz w:val="18"/>
+              </w:rPr>
+            </w:r>
+            <w:r>
+              <w:rPr>
+                <w:sz w:val="18"/>
+              </w:rPr>
+              <w:t>8.00</w:t>
+            </w:r>
+          </w:p>
+        </w:tc>
+        <w:tc>
+          <w:tcPr>
+            <w:tcW w:type="dxa" w:w="3324"/>
+          </w:tcPr>
+          <w:p>
+            <w:r>
+              <w:rPr>
+                <w:sz w:val="18"/>
+              </w:rPr>
+            </w:r>
+            <w:r>
+              <w:rPr>
+                <w:sz w:val="18"/>
+              </w:rPr>
+              <w:t>【待确认：C4】</w:t>
+            </w:r>
+          </w:p>
+        </w:tc>
+      </w:tr>
+    </w:tbl>
+    <w:p/>
+    <w:p>
+      <w:pPr>
+        <w:pStyle w:val="ListBullet"/>
+      </w:pPr>
+      <w:r>
+        <w:t>拉活的团长分成 0.40 来自“团长 1.6 元包含给团员的 1.2 元”。100 个拉活按平台直付计算：达人 120 元，团长 40 元，合计 160 元，与“平台付团长 160、团长付团员 120”总额一致；采用哪种付款路径仍由财务方案事项 6 决定。</w:t>
+      </w:r>
+    </w:p>
+    <w:p>
+      <w:pPr>
+        <w:pStyle w:val="ListBullet"/>
+      </w:pPr>
+      <w:r>
+        <w:t>平台计费规则表（平台方案 6.1 节）增加“业绩类型”一列：按（项目、业绩类型、规则）取当天生效的单价。</w:t>
+      </w:r>
+    </w:p>
+    <w:p>
+      <w:pPr>
+        <w:pStyle w:val="ListBullet"/>
+      </w:pPr>
+      <w:r>
+        <w:t>拉活没有旧的“按任务 × 收款人报价”包袱，</w:t>
+      </w:r>
+      <w:r>
+        <w:rPr>
+          <w:b/>
+        </w:rPr>
+        <w:t>直接使用新的角色单价表</w:t>
+      </w:r>
+      <w:r>
+        <w:t>；拉新在平台方案阶段 2 之前继续使用现有定价，互不干扰。</w:t>
+      </w:r>
+    </w:p>
+    <w:p>
+      <w:pPr>
+        <w:pStyle w:val="Heading2"/>
+      </w:pPr>
+      <w:r>
+        <w:t>9.6 数据与引擎改动</w:t>
+      </w:r>
+    </w:p>
+    <w:tbl>
+      <w:tblPr>
+        <w:tblStyle w:val="TableGrid"/>
+        <w:tblW w:type="auto" w:w="0"/>
+        <w:jc w:val="center"/>
+        <w:tblLook w:firstColumn="1" w:firstRow="1" w:lastColumn="0" w:lastRow="0" w:noHBand="0" w:noVBand="1" w:val="04A0"/>
+      </w:tblPr>
+      <w:tblGrid>
+        <w:gridCol w:w="4986"/>
+        <w:gridCol w:w="4986"/>
+      </w:tblGrid>
+      <w:tr>
+        <w:tc>
+          <w:tcPr>
+            <w:tcW w:type="dxa" w:w="4986"/>
+          </w:tcPr>
+          <w:p>
+            <w:r>
+              <w:rPr>
+                <w:b/>
+                <w:sz w:val="18"/>
+              </w:rPr>
+            </w:r>
+            <w:r>
+              <w:rPr>
+                <w:b/>
+                <w:sz w:val="18"/>
+              </w:rPr>
+              <w:t>改动</w:t>
+            </w:r>
+          </w:p>
+        </w:tc>
+        <w:tc>
+          <w:tcPr>
+            <w:tcW w:type="dxa" w:w="4986"/>
+          </w:tcPr>
+          <w:p>
+            <w:r>
+              <w:rPr>
+                <w:b/>
+                <w:sz w:val="18"/>
+              </w:rPr>
+            </w:r>
+            <w:r>
+              <w:rPr>
+                <w:b/>
+                <w:sz w:val="18"/>
+              </w:rPr>
+              <w:t>说明</w:t>
+            </w:r>
+          </w:p>
+        </w:tc>
+      </w:tr>
+      <w:tr>
+        <w:tc>
+          <w:tcPr>
+            <w:tcW w:type="dxa" w:w="4986"/>
+          </w:tcPr>
+          <w:p>
+            <w:r>
+              <w:rPr>
+                <w:sz w:val="18"/>
+              </w:rPr>
+            </w:r>
+            <w:r>
+              <w:rPr>
+                <w:sz w:val="18"/>
+              </w:rPr>
+              <w:t>报表类型增加“拉活”</w:t>
+            </w:r>
+          </w:p>
+        </w:tc>
+        <w:tc>
+          <w:tcPr>
+            <w:tcW w:type="dxa" w:w="4986"/>
+          </w:tcPr>
+          <w:p>
+            <w:r>
+              <w:rPr>
+                <w:sz w:val="18"/>
+              </w:rPr>
+            </w:r>
+            <w:r>
+              <w:rPr>
+                <w:rFonts w:ascii="Consolas" w:hAnsi="Consolas"/>
+                <w:sz w:val="18"/>
+              </w:rPr>
+              <w:t>zh_import_batches.report_kind</w:t>
+            </w:r>
+            <w:r>
+              <w:rPr>
+                <w:sz w:val="18"/>
+              </w:rPr>
+              <w:t xml:space="preserve"> 增加 </w:t>
+            </w:r>
+            <w:r>
+              <w:rPr>
+                <w:rFonts w:ascii="Consolas" w:hAnsi="Consolas"/>
+                <w:sz w:val="18"/>
+              </w:rPr>
+              <w:t>activation</w:t>
+            </w:r>
+            <w:r>
+              <w:rPr>
+                <w:sz w:val="18"/>
+              </w:rPr>
+              <w:t>；拉活使用独立的解析模板，拉新解析器不改</w:t>
+            </w:r>
+          </w:p>
+        </w:tc>
+      </w:tr>
+      <w:tr>
+        <w:tc>
+          <w:tcPr>
+            <w:tcW w:type="dxa" w:w="4986"/>
+          </w:tcPr>
+          <w:p>
+            <w:r>
+              <w:rPr>
+                <w:sz w:val="18"/>
+              </w:rPr>
+            </w:r>
+            <w:r>
+              <w:rPr>
+                <w:sz w:val="18"/>
+              </w:rPr>
+              <w:t>业绩增加类型维度</w:t>
+            </w:r>
+          </w:p>
+        </w:tc>
+        <w:tc>
+          <w:tcPr>
+            <w:tcW w:type="dxa" w:w="4986"/>
+          </w:tcPr>
+          <w:p>
+            <w:r>
+              <w:rPr>
+                <w:sz w:val="18"/>
+              </w:rPr>
+            </w:r>
+            <w:r>
+              <w:rPr>
+                <w:rFonts w:ascii="Consolas" w:hAnsi="Consolas"/>
+                <w:sz w:val="18"/>
+              </w:rPr>
+              <w:t>zh_metric_facts</w:t>
+            </w:r>
+            <w:r>
+              <w:rPr>
+                <w:sz w:val="18"/>
+              </w:rPr>
+              <w:t xml:space="preserve"> 增加 </w:t>
+            </w:r>
+            <w:r>
+              <w:rPr>
+                <w:rFonts w:ascii="Consolas" w:hAnsi="Consolas"/>
+                <w:sz w:val="18"/>
+              </w:rPr>
+              <w:t>metric_type</w:t>
+            </w:r>
+            <w:r>
+              <w:rPr>
+                <w:sz w:val="18"/>
+              </w:rPr>
+              <w:t>（</w:t>
+            </w:r>
+            <w:r>
+              <w:rPr>
+                <w:rFonts w:ascii="Consolas" w:hAnsi="Consolas"/>
+                <w:sz w:val="18"/>
+              </w:rPr>
+              <w:t>new_user</w:t>
+            </w:r>
+            <w:r>
+              <w:rPr>
+                <w:sz w:val="18"/>
+              </w:rPr>
+              <w:t xml:space="preserve"> / </w:t>
+            </w:r>
+            <w:r>
+              <w:rPr>
+                <w:rFonts w:ascii="Consolas" w:hAnsi="Consolas"/>
+                <w:sz w:val="18"/>
+              </w:rPr>
+              <w:t>activation</w:t>
+            </w:r>
+            <w:r>
+              <w:rPr>
+                <w:sz w:val="18"/>
+              </w:rPr>
+              <w:t xml:space="preserve">），现有数据默认 </w:t>
+            </w:r>
+            <w:r>
+              <w:rPr>
+                <w:rFonts w:ascii="Consolas" w:hAnsi="Consolas"/>
+                <w:sz w:val="18"/>
+              </w:rPr>
+              <w:t>new_user</w:t>
+            </w:r>
+            <w:r>
+              <w:rPr>
+                <w:sz w:val="18"/>
+              </w:rPr>
+              <w:t>；唯一键改为（账号、渠道对应关系、关键词、日期、业绩类型）。同一天同一关键词的拉新和拉活是两条独立数据，不作为互相覆盖的更正（与拉新拉活计划一致）。迁移注意事项见 V12</w:t>
+            </w:r>
+          </w:p>
+        </w:tc>
+      </w:tr>
+      <w:tr>
+        <w:tc>
+          <w:tcPr>
+            <w:tcW w:type="dxa" w:w="4986"/>
+          </w:tcPr>
+          <w:p>
+            <w:r>
+              <w:rPr>
+                <w:sz w:val="18"/>
+              </w:rPr>
+            </w:r>
+            <w:r>
+              <w:rPr>
+                <w:sz w:val="18"/>
+              </w:rPr>
+              <w:t>拉活的数据内容</w:t>
+            </w:r>
+          </w:p>
+        </w:tc>
+        <w:tc>
+          <w:tcPr>
+            <w:tcW w:type="dxa" w:w="4986"/>
+          </w:tcPr>
+          <w:p>
+            <w:r>
+              <w:rPr>
+                <w:sz w:val="18"/>
+              </w:rPr>
+            </w:r>
+            <w:r>
+              <w:rPr>
+                <w:sz w:val="18"/>
+              </w:rPr>
+              <w:t>拉活量、上游结算金额、代理名称；上游结算金额只用于核对，不直接作为付款金额</w:t>
+            </w:r>
+          </w:p>
+        </w:tc>
+      </w:tr>
+      <w:tr>
+        <w:tc>
+          <w:tcPr>
+            <w:tcW w:type="dxa" w:w="4986"/>
+          </w:tcPr>
+          <w:p>
+            <w:r>
+              <w:rPr>
+                <w:sz w:val="18"/>
+              </w:rPr>
+            </w:r>
+            <w:r>
+              <w:rPr>
+                <w:sz w:val="18"/>
+              </w:rPr>
+              <w:t>计价</w:t>
+            </w:r>
+          </w:p>
+        </w:tc>
+        <w:tc>
+          <w:tcPr>
+            <w:tcW w:type="dxa" w:w="4986"/>
+          </w:tcPr>
+          <w:p>
+            <w:r>
+              <w:rPr>
+                <w:sz w:val="18"/>
+              </w:rPr>
+            </w:r>
+            <w:r>
+              <w:rPr>
+                <w:sz w:val="18"/>
+              </w:rPr>
+              <w:t>归属判断沿用同一套逻辑；计价时按业绩类型取对应单价；拉活使用独立的规则代码，与拉新的确认和更正链互不相关</w:t>
+            </w:r>
+          </w:p>
+        </w:tc>
+      </w:tr>
+      <w:tr>
+        <w:tc>
+          <w:tcPr>
+            <w:tcW w:type="dxa" w:w="4986"/>
+          </w:tcPr>
+          <w:p>
+            <w:r>
+              <w:rPr>
+                <w:sz w:val="18"/>
+              </w:rPr>
+            </w:r>
+            <w:r>
+              <w:rPr>
+                <w:sz w:val="18"/>
+              </w:rPr>
+              <w:t>待办与结果</w:t>
+            </w:r>
+          </w:p>
+        </w:tc>
+        <w:tc>
+          <w:tcPr>
+            <w:tcW w:type="dxa" w:w="4986"/>
+          </w:tcPr>
+          <w:p>
+            <w:r>
+              <w:rPr>
+                <w:sz w:val="18"/>
+              </w:rPr>
+            </w:r>
+            <w:r>
+              <w:rPr>
+                <w:sz w:val="18"/>
+              </w:rPr>
+              <w:t>待办、收益明细、账单都带业绩类型；平台收益明细按类型汇总</w:t>
+            </w:r>
+          </w:p>
+        </w:tc>
+      </w:tr>
+      <w:tr>
+        <w:tc>
+          <w:tcPr>
+            <w:tcW w:type="dxa" w:w="4986"/>
+          </w:tcPr>
+          <w:p>
+            <w:r>
+              <w:rPr>
+                <w:sz w:val="18"/>
+              </w:rPr>
+            </w:r>
+            <w:r>
+              <w:rPr>
+                <w:sz w:val="18"/>
+              </w:rPr>
+              <w:t>收入来源</w:t>
+            </w:r>
+          </w:p>
+        </w:tc>
+        <w:tc>
+          <w:tcPr>
+            <w:tcW w:type="dxa" w:w="4986"/>
+          </w:tcPr>
+          <w:p>
+            <w:r>
+              <w:rPr>
+                <w:sz w:val="18"/>
+              </w:rPr>
+            </w:r>
+            <w:r>
+              <w:rPr>
+                <w:sz w:val="18"/>
+              </w:rPr>
+              <w:t>拉新与拉活是不同的事实，公共资金账中的来源天然分开</w:t>
+            </w:r>
+          </w:p>
+        </w:tc>
+      </w:tr>
+    </w:tbl>
+    <w:p/>
+    <w:p>
+      <w:r>
+        <w:t>拉新现有的解析、计价、确认路径不做修改；唯一涉及拉新的改动是唯一键增加一列，以及现有数据默认标为拉新。</w:t>
+      </w:r>
+    </w:p>
+    <w:p>
+      <w:pPr>
+        <w:pStyle w:val="Heading2"/>
+      </w:pPr>
+      <w:r>
+        <w:t>9.7 活动补贴（起量期）与红线规则</w:t>
+      </w:r>
+    </w:p>
+    <w:p>
+      <w:r>
+        <w:t>两者都不属于“上传报表”这一步，单独设计，本期只预留：</w:t>
+      </w:r>
+    </w:p>
+    <w:p>
+      <w:pPr>
+        <w:pStyle w:val="ListBullet"/>
+      </w:pPr>
+      <w:r>
+        <w:rPr>
+          <w:b/>
+        </w:rPr>
+        <w:t>起量期补贴</w:t>
+      </w:r>
+      <w:r>
+        <w:t>：活动规则为新手期按 2 元 / 个正常结算；转正后第二个月日均订单环比增长达到 10%，按第一个月拉活量 × 1 元补发；第三个月增长达到 5%，按第一个月拉活量 × 2 元补发。补贴按月计算，单独生成“活动补贴”收益行，</w:t>
+      </w:r>
+      <w:r>
+        <w:rPr>
+          <w:b/>
+        </w:rPr>
+        <w:t>不增加拉活数量</w:t>
+      </w:r>
+      <w:r>
+        <w:t>。需要确认：增长看的是哪类订单（C7）、转正如何判定、补贴是否分给团长和达人（C8）。</w:t>
+      </w:r>
+    </w:p>
+    <w:p>
+      <w:pPr>
+        <w:pStyle w:val="ListBullet"/>
+      </w:pPr>
+      <w:r>
+        <w:rPr>
+          <w:b/>
+        </w:rPr>
+        <w:t>红线规则</w:t>
+      </w:r>
+      <w:r>
+        <w:t>：刷单刷量、发布全文、套发任务、回传不合规，命中后相关内容不予结算。拉新可以对应报表里的“风险判定”列；拉活表没有风险列，需要确认这些判定从哪里来（C9）。命中时状态为“知乎判定不予结算”，金额不计入，并写明依据。</w:t>
+      </w:r>
+    </w:p>
+    <w:p>
+      <w:pPr>
+        <w:pStyle w:val="Heading2"/>
+      </w:pPr>
+      <w:r>
+        <w:t>9.8 实施安排</w:t>
+      </w:r>
+    </w:p>
+    <w:p>
+      <w:r>
+        <w:t>拉活入口不必等整体改造完成，可以先做：</w:t>
+      </w:r>
+    </w:p>
+    <w:tbl>
+      <w:tblPr>
+        <w:tblStyle w:val="TableGrid"/>
+        <w:tblW w:type="auto" w:w="0"/>
+        <w:jc w:val="center"/>
+        <w:tblLook w:firstColumn="1" w:firstRow="1" w:lastColumn="0" w:lastRow="0" w:noHBand="0" w:noVBand="1" w:val="04A0"/>
+      </w:tblPr>
+      <w:tblGrid>
+        <w:gridCol w:w="3324"/>
+        <w:gridCol w:w="3324"/>
+        <w:gridCol w:w="3324"/>
+      </w:tblGrid>
+      <w:tr>
+        <w:tc>
+          <w:tcPr>
+            <w:tcW w:type="dxa" w:w="3324"/>
+          </w:tcPr>
+          <w:p>
+            <w:r>
+              <w:rPr>
+                <w:b/>
+                <w:sz w:val="18"/>
+              </w:rPr>
+            </w:r>
+            <w:r>
+              <w:rPr>
+                <w:b/>
+                <w:sz w:val="18"/>
+              </w:rPr>
+              <w:t>步骤</w:t>
+            </w:r>
+          </w:p>
+        </w:tc>
+        <w:tc>
+          <w:tcPr>
+            <w:tcW w:type="dxa" w:w="3324"/>
+          </w:tcPr>
+          <w:p>
+            <w:r>
+              <w:rPr>
+                <w:b/>
+                <w:sz w:val="18"/>
+              </w:rPr>
+            </w:r>
+            <w:r>
+              <w:rPr>
+                <w:b/>
+                <w:sz w:val="18"/>
+              </w:rPr>
+              <w:t>内容</w:t>
+            </w:r>
+          </w:p>
+        </w:tc>
+        <w:tc>
+          <w:tcPr>
+            <w:tcW w:type="dxa" w:w="3324"/>
+          </w:tcPr>
+          <w:p>
+            <w:r>
+              <w:rPr>
+                <w:b/>
+                <w:sz w:val="18"/>
+              </w:rPr>
+            </w:r>
+            <w:r>
+              <w:rPr>
+                <w:b/>
+                <w:sz w:val="18"/>
+              </w:rPr>
+              <w:t>对拉新的影响</w:t>
+            </w:r>
+          </w:p>
+        </w:tc>
+      </w:tr>
+      <w:tr>
+        <w:tc>
+          <w:tcPr>
+            <w:tcW w:type="dxa" w:w="3324"/>
+          </w:tcPr>
+          <w:p>
+            <w:r>
+              <w:rPr>
+                <w:sz w:val="18"/>
+              </w:rPr>
+            </w:r>
+            <w:r>
+              <w:rPr>
+                <w:sz w:val="18"/>
+              </w:rPr>
+              <w:t>1</w:t>
+            </w:r>
+          </w:p>
+        </w:tc>
+        <w:tc>
+          <w:tcPr>
+            <w:tcW w:type="dxa" w:w="3324"/>
+          </w:tcPr>
+          <w:p>
+            <w:r>
+              <w:rPr>
+                <w:sz w:val="18"/>
+              </w:rPr>
+            </w:r>
+            <w:r>
+              <w:rPr>
+                <w:sz w:val="18"/>
+              </w:rPr>
+              <w:t>上传前增加“拉新订单 / 拉活”选择；按表头核对类型</w:t>
+            </w:r>
+          </w:p>
+        </w:tc>
+        <w:tc>
+          <w:tcPr>
+            <w:tcW w:type="dxa" w:w="3324"/>
+          </w:tcPr>
+          <w:p>
+            <w:r>
+              <w:rPr>
+                <w:sz w:val="18"/>
+              </w:rPr>
+            </w:r>
+            <w:r>
+              <w:rPr>
+                <w:sz w:val="18"/>
+              </w:rPr>
+              <w:t>无（默认选中拉新，流程不变）</w:t>
+            </w:r>
+          </w:p>
+        </w:tc>
+      </w:tr>
+      <w:tr>
+        <w:tc>
+          <w:tcPr>
+            <w:tcW w:type="dxa" w:w="3324"/>
+          </w:tcPr>
+          <w:p>
+            <w:r>
+              <w:rPr>
+                <w:sz w:val="18"/>
+              </w:rPr>
+            </w:r>
+            <w:r>
+              <w:rPr>
+                <w:sz w:val="18"/>
+              </w:rPr>
+              <w:t>2</w:t>
+            </w:r>
+          </w:p>
+        </w:tc>
+        <w:tc>
+          <w:tcPr>
+            <w:tcW w:type="dxa" w:w="3324"/>
+          </w:tcPr>
+          <w:p>
+            <w:r>
+              <w:rPr>
+                <w:sz w:val="18"/>
+              </w:rPr>
+            </w:r>
+            <w:r>
+              <w:rPr>
+                <w:sz w:val="18"/>
+              </w:rPr>
+              <w:t>拉活解析模板；业绩类型字段和唯一键迁移</w:t>
+            </w:r>
+          </w:p>
+        </w:tc>
+        <w:tc>
+          <w:tcPr>
+            <w:tcW w:type="dxa" w:w="3324"/>
+          </w:tcPr>
+          <w:p>
+            <w:r>
+              <w:rPr>
+                <w:sz w:val="18"/>
+              </w:rPr>
+            </w:r>
+            <w:r>
+              <w:rPr>
+                <w:sz w:val="18"/>
+              </w:rPr>
+              <w:t>唯一键增加一列，现有数据默认拉新</w:t>
+            </w:r>
+          </w:p>
+        </w:tc>
+      </w:tr>
+      <w:tr>
+        <w:tc>
+          <w:tcPr>
+            <w:tcW w:type="dxa" w:w="3324"/>
+          </w:tcPr>
+          <w:p>
+            <w:r>
+              <w:rPr>
+                <w:sz w:val="18"/>
+              </w:rPr>
+            </w:r>
+            <w:r>
+              <w:rPr>
+                <w:sz w:val="18"/>
+              </w:rPr>
+              <w:t>3</w:t>
+            </w:r>
+          </w:p>
+        </w:tc>
+        <w:tc>
+          <w:tcPr>
+            <w:tcW w:type="dxa" w:w="3324"/>
+          </w:tcPr>
+          <w:p>
+            <w:r>
+              <w:rPr>
+                <w:sz w:val="18"/>
+              </w:rPr>
+            </w:r>
+            <w:r>
+              <w:rPr>
+                <w:sz w:val="18"/>
+              </w:rPr>
+              <w:t>拉活角色单价表（含业绩类型）与计价；结算金额核对</w:t>
+            </w:r>
+          </w:p>
+        </w:tc>
+        <w:tc>
+          <w:tcPr>
+            <w:tcW w:type="dxa" w:w="3324"/>
+          </w:tcPr>
+          <w:p>
+            <w:r>
+              <w:rPr>
+                <w:sz w:val="18"/>
+              </w:rPr>
+            </w:r>
+            <w:r>
+              <w:rPr>
+                <w:sz w:val="18"/>
+              </w:rPr>
+              <w:t>无</w:t>
+            </w:r>
+          </w:p>
+        </w:tc>
+      </w:tr>
+      <w:tr>
+        <w:tc>
+          <w:tcPr>
+            <w:tcW w:type="dxa" w:w="3324"/>
+          </w:tcPr>
+          <w:p>
+            <w:r>
+              <w:rPr>
+                <w:sz w:val="18"/>
+              </w:rPr>
+            </w:r>
+            <w:r>
+              <w:rPr>
+                <w:sz w:val="18"/>
+              </w:rPr>
+              <w:t>4</w:t>
+            </w:r>
+          </w:p>
+        </w:tc>
+        <w:tc>
+          <w:tcPr>
+            <w:tcW w:type="dxa" w:w="3324"/>
+          </w:tcPr>
+          <w:p>
+            <w:r>
+              <w:rPr>
+                <w:sz w:val="18"/>
+              </w:rPr>
+            </w:r>
+            <w:r>
+              <w:rPr>
+                <w:sz w:val="18"/>
+              </w:rPr>
+              <w:t>结果表、账单、收益页增加业绩类型标签和筛选</w:t>
+            </w:r>
+          </w:p>
+        </w:tc>
+        <w:tc>
+          <w:tcPr>
+            <w:tcW w:type="dxa" w:w="3324"/>
+          </w:tcPr>
+          <w:p>
+            <w:r>
+              <w:rPr>
+                <w:sz w:val="18"/>
+              </w:rPr>
+            </w:r>
+            <w:r>
+              <w:rPr>
+                <w:sz w:val="18"/>
+              </w:rPr>
+              <w:t>只增加展示</w:t>
+            </w:r>
+          </w:p>
+        </w:tc>
+      </w:tr>
+      <w:tr>
+        <w:tc>
+          <w:tcPr>
+            <w:tcW w:type="dxa" w:w="3324"/>
+          </w:tcPr>
+          <w:p>
+            <w:r>
+              <w:rPr>
+                <w:sz w:val="18"/>
+              </w:rPr>
+            </w:r>
+            <w:r>
+              <w:rPr>
+                <w:sz w:val="18"/>
+              </w:rPr>
+              <w:t>5</w:t>
+            </w:r>
+          </w:p>
+        </w:tc>
+        <w:tc>
+          <w:tcPr>
+            <w:tcW w:type="dxa" w:w="3324"/>
+          </w:tcPr>
+          <w:p>
+            <w:r>
+              <w:rPr>
+                <w:sz w:val="18"/>
+              </w:rPr>
+            </w:r>
+            <w:r>
+              <w:rPr>
+                <w:sz w:val="18"/>
+              </w:rPr>
+              <w:t>并入整体改造：分析过程面板、多维表格、平台收益明细</w:t>
+            </w:r>
+          </w:p>
+        </w:tc>
+        <w:tc>
+          <w:tcPr>
+            <w:tcW w:type="dxa" w:w="3324"/>
+          </w:tcPr>
+          <w:p>
+            <w:r>
+              <w:rPr>
+                <w:sz w:val="18"/>
+              </w:rPr>
+            </w:r>
+            <w:r>
+              <w:rPr>
+                <w:sz w:val="18"/>
+              </w:rPr>
+              <w:t>与平台方案阶段 2、3 一起</w:t>
+            </w:r>
+          </w:p>
+        </w:tc>
+      </w:tr>
+    </w:tbl>
+    <w:p/>
+    <w:p>
+      <w:pPr>
+        <w:pStyle w:val="Heading2"/>
+      </w:pPr>
+      <w:r>
+        <w:t>9.9 验收用例</w:t>
+      </w:r>
+    </w:p>
+    <w:tbl>
+      <w:tblPr>
+        <w:tblStyle w:val="TableGrid"/>
+        <w:tblW w:type="auto" w:w="0"/>
+        <w:jc w:val="center"/>
+        <w:tblLook w:firstColumn="1" w:firstRow="1" w:lastColumn="0" w:lastRow="0" w:noHBand="0" w:noVBand="1" w:val="04A0"/>
+      </w:tblPr>
+      <w:tblGrid>
+        <w:gridCol w:w="3324"/>
+        <w:gridCol w:w="3324"/>
+        <w:gridCol w:w="3324"/>
+      </w:tblGrid>
+      <w:tr>
+        <w:tc>
+          <w:tcPr>
+            <w:tcW w:type="dxa" w:w="3324"/>
+          </w:tcPr>
+          <w:p>
+            <w:r>
+              <w:rPr>
+                <w:b/>
+                <w:sz w:val="18"/>
+              </w:rPr>
+            </w:r>
+            <w:r>
+              <w:rPr>
+                <w:b/>
+                <w:sz w:val="18"/>
+              </w:rPr>
+              <w:t>编号</w:t>
+            </w:r>
+          </w:p>
+        </w:tc>
+        <w:tc>
+          <w:tcPr>
+            <w:tcW w:type="dxa" w:w="3324"/>
+          </w:tcPr>
+          <w:p>
+            <w:r>
+              <w:rPr>
+                <w:b/>
+                <w:sz w:val="18"/>
+              </w:rPr>
+            </w:r>
+            <w:r>
+              <w:rPr>
+                <w:b/>
+                <w:sz w:val="18"/>
+              </w:rPr>
+              <w:t>场景</w:t>
+            </w:r>
+          </w:p>
+        </w:tc>
+        <w:tc>
+          <w:tcPr>
+            <w:tcW w:type="dxa" w:w="3324"/>
+          </w:tcPr>
+          <w:p>
+            <w:r>
+              <w:rPr>
+                <w:b/>
+                <w:sz w:val="18"/>
+              </w:rPr>
+            </w:r>
+            <w:r>
+              <w:rPr>
+                <w:b/>
+                <w:sz w:val="18"/>
+              </w:rPr>
+              <w:t>期望</w:t>
+            </w:r>
+          </w:p>
+        </w:tc>
+      </w:tr>
+      <w:tr>
+        <w:tc>
+          <w:tcPr>
+            <w:tcW w:type="dxa" w:w="3324"/>
+          </w:tcPr>
+          <w:p>
+            <w:r>
+              <w:rPr>
+                <w:sz w:val="18"/>
+              </w:rPr>
+            </w:r>
+            <w:r>
+              <w:rPr>
+                <w:sz w:val="18"/>
+              </w:rPr>
+              <w:t>L1</w:t>
+            </w:r>
+          </w:p>
+        </w:tc>
+        <w:tc>
+          <w:tcPr>
+            <w:tcW w:type="dxa" w:w="3324"/>
+          </w:tcPr>
+          <w:p>
+            <w:r>
+              <w:rPr>
+                <w:sz w:val="18"/>
+              </w:rPr>
+            </w:r>
+            <w:r>
+              <w:rPr>
+                <w:sz w:val="18"/>
+              </w:rPr>
+              <w:t>选“拉新订单”，上传知乎官方订单样例</w:t>
+            </w:r>
+          </w:p>
+        </w:tc>
+        <w:tc>
+          <w:tcPr>
+            <w:tcW w:type="dxa" w:w="3324"/>
+          </w:tcPr>
+          <w:p>
+            <w:r>
+              <w:rPr>
+                <w:sz w:val="18"/>
+              </w:rPr>
+            </w:r>
+            <w:r>
+              <w:rPr>
+                <w:sz w:val="18"/>
+              </w:rPr>
+              <w:t>结果与现在完全一致（回归）</w:t>
+            </w:r>
+          </w:p>
+        </w:tc>
+      </w:tr>
+      <w:tr>
+        <w:tc>
+          <w:tcPr>
+            <w:tcW w:type="dxa" w:w="3324"/>
+          </w:tcPr>
+          <w:p>
+            <w:r>
+              <w:rPr>
+                <w:sz w:val="18"/>
+              </w:rPr>
+            </w:r>
+            <w:r>
+              <w:rPr>
+                <w:sz w:val="18"/>
+              </w:rPr>
+              <w:t>L2</w:t>
+            </w:r>
+          </w:p>
+        </w:tc>
+        <w:tc>
+          <w:tcPr>
+            <w:tcW w:type="dxa" w:w="3324"/>
+          </w:tcPr>
+          <w:p>
+            <w:r>
+              <w:rPr>
+                <w:sz w:val="18"/>
+              </w:rPr>
+            </w:r>
+            <w:r>
+              <w:rPr>
+                <w:sz w:val="18"/>
+              </w:rPr>
+              <w:t>选“拉活”，上传拉活表（浩浩哑女 1 个，执行人为团队达人）</w:t>
+            </w:r>
+          </w:p>
+        </w:tc>
+        <w:tc>
+          <w:tcPr>
+            <w:tcW w:type="dxa" w:w="3324"/>
+          </w:tcPr>
+          <w:p>
+            <w:r>
+              <w:rPr>
+                <w:sz w:val="18"/>
+              </w:rPr>
+            </w:r>
+            <w:r>
+              <w:rPr>
+                <w:sz w:val="18"/>
+              </w:rPr>
+              <w:t>达人 1.20、团长 0.40</w:t>
+            </w:r>
+          </w:p>
+        </w:tc>
+      </w:tr>
+      <w:tr>
+        <w:tc>
+          <w:tcPr>
+            <w:tcW w:type="dxa" w:w="3324"/>
+          </w:tcPr>
+          <w:p>
+            <w:r>
+              <w:rPr>
+                <w:sz w:val="18"/>
+              </w:rPr>
+            </w:r>
+            <w:r>
+              <w:rPr>
+                <w:sz w:val="18"/>
+              </w:rPr>
+              <w:t>L3</w:t>
+            </w:r>
+          </w:p>
+        </w:tc>
+        <w:tc>
+          <w:tcPr>
+            <w:tcW w:type="dxa" w:w="3324"/>
+          </w:tcPr>
+          <w:p>
+            <w:r>
+              <w:rPr>
+                <w:sz w:val="18"/>
+              </w:rPr>
+            </w:r>
+            <w:r>
+              <w:rPr>
+                <w:sz w:val="18"/>
+              </w:rPr>
+              <w:t>同一天同一关键词：拉新 3 单、拉活 5 个</w:t>
+            </w:r>
+          </w:p>
+        </w:tc>
+        <w:tc>
+          <w:tcPr>
+            <w:tcW w:type="dxa" w:w="3324"/>
+          </w:tcPr>
+          <w:p>
+            <w:r>
+              <w:rPr>
+                <w:sz w:val="18"/>
+              </w:rPr>
+            </w:r>
+            <w:r>
+              <w:rPr>
+                <w:sz w:val="18"/>
+              </w:rPr>
+              <w:t>两类分别显示、分别计价，互不覆盖</w:t>
+            </w:r>
+          </w:p>
+        </w:tc>
+      </w:tr>
+      <w:tr>
+        <w:tc>
+          <w:tcPr>
+            <w:tcW w:type="dxa" w:w="3324"/>
+          </w:tcPr>
+          <w:p>
+            <w:r>
+              <w:rPr>
+                <w:sz w:val="18"/>
+              </w:rPr>
+            </w:r>
+            <w:r>
+              <w:rPr>
+                <w:sz w:val="18"/>
+              </w:rPr>
+              <w:t>L4</w:t>
+            </w:r>
+          </w:p>
+        </w:tc>
+        <w:tc>
+          <w:tcPr>
+            <w:tcW w:type="dxa" w:w="3324"/>
+          </w:tcPr>
+          <w:p>
+            <w:r>
+              <w:rPr>
+                <w:sz w:val="18"/>
+              </w:rPr>
+            </w:r>
+            <w:r>
+              <w:rPr>
+                <w:sz w:val="18"/>
+              </w:rPr>
+              <w:t>拉新已确认后再上传同日拉活</w:t>
+            </w:r>
+          </w:p>
+        </w:tc>
+        <w:tc>
+          <w:tcPr>
+            <w:tcW w:type="dxa" w:w="3324"/>
+          </w:tcPr>
+          <w:p>
+            <w:r>
+              <w:rPr>
+                <w:sz w:val="18"/>
+              </w:rPr>
+            </w:r>
+            <w:r>
+              <w:rPr>
+                <w:sz w:val="18"/>
+              </w:rPr>
+              <w:t>拉新已确认金额不变，拉活单独待确认</w:t>
+            </w:r>
+          </w:p>
+        </w:tc>
+      </w:tr>
+      <w:tr>
+        <w:tc>
+          <w:tcPr>
+            <w:tcW w:type="dxa" w:w="3324"/>
+          </w:tcPr>
+          <w:p>
+            <w:r>
+              <w:rPr>
+                <w:sz w:val="18"/>
+              </w:rPr>
+            </w:r>
+            <w:r>
+              <w:rPr>
+                <w:sz w:val="18"/>
+              </w:rPr>
+              <w:t>L5</w:t>
+            </w:r>
+          </w:p>
+        </w:tc>
+        <w:tc>
+          <w:tcPr>
+            <w:tcW w:type="dxa" w:w="3324"/>
+          </w:tcPr>
+          <w:p>
+            <w:r>
+              <w:rPr>
+                <w:sz w:val="18"/>
+              </w:rPr>
+            </w:r>
+            <w:r>
+              <w:rPr>
+                <w:sz w:val="18"/>
+              </w:rPr>
+              <w:t>选了“拉新订单”却上传拉活表</w:t>
+            </w:r>
+          </w:p>
+        </w:tc>
+        <w:tc>
+          <w:tcPr>
+            <w:tcW w:type="dxa" w:w="3324"/>
+          </w:tcPr>
+          <w:p>
+            <w:r>
+              <w:rPr>
+                <w:sz w:val="18"/>
+              </w:rPr>
+            </w:r>
+            <w:r>
+              <w:rPr>
+                <w:sz w:val="18"/>
+              </w:rPr>
+              <w:t>第 1 步提示类型不符，可一键改为拉活</w:t>
+            </w:r>
+          </w:p>
+        </w:tc>
+      </w:tr>
+      <w:tr>
+        <w:tc>
+          <w:tcPr>
+            <w:tcW w:type="dxa" w:w="3324"/>
+          </w:tcPr>
+          <w:p>
+            <w:r>
+              <w:rPr>
+                <w:sz w:val="18"/>
+              </w:rPr>
+            </w:r>
+            <w:r>
+              <w:rPr>
+                <w:sz w:val="18"/>
+              </w:rPr>
+              <w:t>L6</w:t>
+            </w:r>
+          </w:p>
+        </w:tc>
+        <w:tc>
+          <w:tcPr>
+            <w:tcW w:type="dxa" w:w="3324"/>
+          </w:tcPr>
+          <w:p>
+            <w:r>
+              <w:rPr>
+                <w:sz w:val="18"/>
+              </w:rPr>
+            </w:r>
+            <w:r>
+              <w:rPr>
+                <w:sz w:val="18"/>
+              </w:rPr>
+              <w:t>拉活表结算金额 ≠ 拉活量 × 2</w:t>
+            </w:r>
+          </w:p>
+        </w:tc>
+        <w:tc>
+          <w:tcPr>
+            <w:tcW w:type="dxa" w:w="3324"/>
+          </w:tcPr>
+          <w:p>
+            <w:r>
+              <w:rPr>
+                <w:sz w:val="18"/>
+              </w:rPr>
+            </w:r>
+            <w:r>
+              <w:rPr>
+                <w:sz w:val="18"/>
+              </w:rPr>
+              <w:t>标为“结算金额对不上”，财务选择后继续</w:t>
+            </w:r>
+          </w:p>
+        </w:tc>
+      </w:tr>
+      <w:tr>
+        <w:tc>
+          <w:tcPr>
+            <w:tcW w:type="dxa" w:w="3324"/>
+          </w:tcPr>
+          <w:p>
+            <w:r>
+              <w:rPr>
+                <w:sz w:val="18"/>
+              </w:rPr>
+            </w:r>
+            <w:r>
+              <w:rPr>
+                <w:sz w:val="18"/>
+              </w:rPr>
+              <w:t>L7</w:t>
+            </w:r>
+          </w:p>
+        </w:tc>
+        <w:tc>
+          <w:tcPr>
+            <w:tcW w:type="dxa" w:w="3324"/>
+          </w:tcPr>
+          <w:p>
+            <w:r>
+              <w:rPr>
+                <w:sz w:val="18"/>
+              </w:rPr>
+            </w:r>
+            <w:r>
+              <w:rPr>
+                <w:sz w:val="18"/>
+              </w:rPr>
+              <w:t>拉活表代理名称不是本项目代理</w:t>
+            </w:r>
+          </w:p>
+        </w:tc>
+        <w:tc>
+          <w:tcPr>
+            <w:tcW w:type="dxa" w:w="3324"/>
+          </w:tcPr>
+          <w:p>
+            <w:r>
+              <w:rPr>
+                <w:sz w:val="18"/>
+              </w:rPr>
+            </w:r>
+            <w:r>
+              <w:rPr>
+                <w:sz w:val="18"/>
+              </w:rPr>
+              <w:t>提示核对，不自动计费</w:t>
+            </w:r>
+          </w:p>
+        </w:tc>
+      </w:tr>
+      <w:tr>
+        <w:tc>
+          <w:tcPr>
+            <w:tcW w:type="dxa" w:w="3324"/>
+          </w:tcPr>
+          <w:p>
+            <w:r>
+              <w:rPr>
+                <w:sz w:val="18"/>
+              </w:rPr>
+            </w:r>
+            <w:r>
+              <w:rPr>
+                <w:sz w:val="18"/>
+              </w:rPr>
+              <w:t>L8</w:t>
+            </w:r>
+          </w:p>
+        </w:tc>
+        <w:tc>
+          <w:tcPr>
+            <w:tcW w:type="dxa" w:w="3324"/>
+          </w:tcPr>
+          <w:p>
+            <w:r>
+              <w:rPr>
+                <w:sz w:val="18"/>
+              </w:rPr>
+            </w:r>
+            <w:r>
+              <w:rPr>
+                <w:sz w:val="18"/>
+              </w:rPr>
+              <w:t>拉活更正（同日同词新值）</w:t>
+            </w:r>
+          </w:p>
+        </w:tc>
+        <w:tc>
+          <w:tcPr>
+            <w:tcW w:type="dxa" w:w="3324"/>
+          </w:tcPr>
+          <w:p>
+            <w:r>
+              <w:rPr>
+                <w:sz w:val="18"/>
+              </w:rPr>
+            </w:r>
+            <w:r>
+              <w:rPr>
+                <w:sz w:val="18"/>
+              </w:rPr>
+              <w:t>只影响拉活，拉新不变</w:t>
+            </w:r>
+          </w:p>
+        </w:tc>
+      </w:tr>
+      <w:tr>
+        <w:tc>
+          <w:tcPr>
+            <w:tcW w:type="dxa" w:w="3324"/>
+          </w:tcPr>
+          <w:p>
+            <w:r>
+              <w:rPr>
+                <w:sz w:val="18"/>
+              </w:rPr>
+            </w:r>
+            <w:r>
+              <w:rPr>
+                <w:sz w:val="18"/>
+              </w:rPr>
+              <w:t>L9</w:t>
+            </w:r>
+          </w:p>
+        </w:tc>
+        <w:tc>
+          <w:tcPr>
+            <w:tcW w:type="dxa" w:w="3324"/>
+          </w:tcPr>
+          <w:p>
+            <w:r>
+              <w:rPr>
+                <w:sz w:val="18"/>
+              </w:rPr>
+            </w:r>
+            <w:r>
+              <w:rPr>
+                <w:sz w:val="18"/>
+              </w:rPr>
+              <w:t>团长、达人的“我的收益”</w:t>
+            </w:r>
+          </w:p>
+        </w:tc>
+        <w:tc>
+          <w:tcPr>
+            <w:tcW w:type="dxa" w:w="3324"/>
+          </w:tcPr>
+          <w:p>
+            <w:r>
+              <w:rPr>
+                <w:sz w:val="18"/>
+              </w:rPr>
+            </w:r>
+            <w:r>
+              <w:rPr>
+                <w:sz w:val="18"/>
+              </w:rPr>
+              <w:t>分别显示拉新、拉活的数量和金额，并给出合计</w:t>
+            </w:r>
+          </w:p>
+        </w:tc>
+      </w:tr>
+      <w:tr>
+        <w:tc>
+          <w:tcPr>
+            <w:tcW w:type="dxa" w:w="3324"/>
+          </w:tcPr>
+          <w:p>
+            <w:r>
+              <w:rPr>
+                <w:sz w:val="18"/>
+              </w:rPr>
+            </w:r>
+            <w:r>
+              <w:rPr>
+                <w:sz w:val="18"/>
+              </w:rPr>
+              <w:t>L10</w:t>
+            </w:r>
+          </w:p>
+        </w:tc>
+        <w:tc>
+          <w:tcPr>
+            <w:tcW w:type="dxa" w:w="3324"/>
+          </w:tcPr>
+          <w:p>
+            <w:r>
+              <w:rPr>
+                <w:sz w:val="18"/>
+              </w:rPr>
+            </w:r>
+            <w:r>
+              <w:rPr>
+                <w:sz w:val="18"/>
+              </w:rPr>
+              <w:t>拉活单价缺失（例如独立达人）</w:t>
+            </w:r>
+          </w:p>
+        </w:tc>
+        <w:tc>
+          <w:tcPr>
+            <w:tcW w:type="dxa" w:w="3324"/>
+          </w:tcPr>
+          <w:p>
+            <w:r>
+              <w:rPr>
+                <w:sz w:val="18"/>
+              </w:rPr>
+            </w:r>
+            <w:r>
+              <w:rPr>
+                <w:sz w:val="18"/>
+              </w:rPr>
+              <w:t>行状态为“拉活单价还没设置”，保留不丢，设置后自动重算</w:t>
+            </w:r>
+          </w:p>
+        </w:tc>
+      </w:tr>
+    </w:tbl>
+    <w:p/>
+    <w:p>
+      <w:pPr>
+        <w:pStyle w:val="Heading2"/>
+      </w:pPr>
+      <w:r>
+        <w:t>9.10 待确认事项</w:t>
+      </w:r>
+    </w:p>
+    <w:tbl>
+      <w:tblPr>
+        <w:tblStyle w:val="TableGrid"/>
+        <w:tblW w:type="auto" w:w="0"/>
+        <w:jc w:val="center"/>
+        <w:tblLook w:firstColumn="1" w:firstRow="1" w:lastColumn="0" w:lastRow="0" w:noHBand="0" w:noVBand="1" w:val="04A0"/>
+      </w:tblPr>
+      <w:tblGrid>
+        <w:gridCol w:w="2493"/>
+        <w:gridCol w:w="2493"/>
+        <w:gridCol w:w="2493"/>
+        <w:gridCol w:w="2493"/>
+      </w:tblGrid>
+      <w:tr>
+        <w:tc>
+          <w:tcPr>
+            <w:tcW w:type="dxa" w:w="2493"/>
+          </w:tcPr>
+          <w:p>
+            <w:r>
+              <w:rPr>
+                <w:b/>
+                <w:sz w:val="18"/>
+              </w:rPr>
+            </w:r>
+            <w:r>
+              <w:rPr>
+                <w:b/>
+                <w:sz w:val="18"/>
+              </w:rPr>
+              <w:t>编号</w:t>
+            </w:r>
+          </w:p>
+        </w:tc>
+        <w:tc>
+          <w:tcPr>
+            <w:tcW w:type="dxa" w:w="2493"/>
+          </w:tcPr>
+          <w:p>
+            <w:r>
+              <w:rPr>
+                <w:b/>
+                <w:sz w:val="18"/>
+              </w:rPr>
+            </w:r>
+            <w:r>
+              <w:rPr>
+                <w:b/>
+                <w:sz w:val="18"/>
+              </w:rPr>
+              <w:t>问题</w:t>
+            </w:r>
+          </w:p>
+        </w:tc>
+        <w:tc>
+          <w:tcPr>
+            <w:tcW w:type="dxa" w:w="2493"/>
+          </w:tcPr>
+          <w:p>
+            <w:r>
+              <w:rPr>
+                <w:b/>
+                <w:sz w:val="18"/>
+              </w:rPr>
+            </w:r>
+            <w:r>
+              <w:rPr>
+                <w:b/>
+                <w:sz w:val="18"/>
+              </w:rPr>
+              <w:t>建议默认值</w:t>
+            </w:r>
+          </w:p>
+        </w:tc>
+        <w:tc>
+          <w:tcPr>
+            <w:tcW w:type="dxa" w:w="2493"/>
+          </w:tcPr>
+          <w:p>
+            <w:r>
+              <w:rPr>
+                <w:b/>
+                <w:sz w:val="18"/>
+              </w:rPr>
+            </w:r>
+            <w:r>
+              <w:rPr>
+                <w:b/>
+                <w:sz w:val="18"/>
+              </w:rPr>
+              <w:t>结论</w:t>
+            </w:r>
+          </w:p>
+        </w:tc>
+      </w:tr>
+      <w:tr>
+        <w:tc>
+          <w:tcPr>
+            <w:tcW w:type="dxa" w:w="2493"/>
+          </w:tcPr>
+          <w:p>
+            <w:r>
+              <w:rPr>
+                <w:sz w:val="18"/>
+              </w:rPr>
+            </w:r>
+            <w:r>
+              <w:rPr>
+                <w:sz w:val="18"/>
+              </w:rPr>
+              <w:t>C1</w:t>
+            </w:r>
+          </w:p>
+        </w:tc>
+        <w:tc>
+          <w:tcPr>
+            <w:tcW w:type="dxa" w:w="2493"/>
+          </w:tcPr>
+          <w:p>
+            <w:r>
+              <w:rPr>
+                <w:sz w:val="18"/>
+              </w:rPr>
+            </w:r>
+            <w:r>
+              <w:rPr>
+                <w:sz w:val="18"/>
+              </w:rPr>
+              <w:t>已上传的“订单量”数据是否全部算拉新</w:t>
+            </w:r>
+          </w:p>
+        </w:tc>
+        <w:tc>
+          <w:tcPr>
+            <w:tcW w:type="dxa" w:w="2493"/>
+          </w:tcPr>
+          <w:p>
+            <w:r>
+              <w:rPr>
+                <w:sz w:val="18"/>
+              </w:rPr>
+            </w:r>
+            <w:r>
+              <w:rPr>
+                <w:sz w:val="18"/>
+              </w:rPr>
+              <w:t>是（样例推广任务为“KOC-会员订单”）</w:t>
+            </w:r>
+          </w:p>
+        </w:tc>
+        <w:tc>
+          <w:tcPr>
+            <w:tcW w:type="dxa" w:w="2493"/>
+          </w:tcPr>
+          <w:p>
+            <w:r>
+              <w:rPr>
+                <w:sz w:val="18"/>
+              </w:rPr>
+            </w:r>
+          </w:p>
+        </w:tc>
+      </w:tr>
+      <w:tr>
+        <w:tc>
+          <w:tcPr>
+            <w:tcW w:type="dxa" w:w="2493"/>
+          </w:tcPr>
+          <w:p>
+            <w:r>
+              <w:rPr>
+                <w:sz w:val="18"/>
+              </w:rPr>
+            </w:r>
+            <w:r>
+              <w:rPr>
+                <w:sz w:val="18"/>
+              </w:rPr>
+              <w:t>C2</w:t>
+            </w:r>
+          </w:p>
+        </w:tc>
+        <w:tc>
+          <w:tcPr>
+            <w:tcW w:type="dxa" w:w="2493"/>
+          </w:tcPr>
+          <w:p>
+            <w:r>
+              <w:rPr>
+                <w:sz w:val="18"/>
+              </w:rPr>
+            </w:r>
+            <w:r>
+              <w:rPr>
+                <w:sz w:val="18"/>
+              </w:rPr>
+              <w:t>区分拉新、拉活的依据：是否就是两种不同的源表</w:t>
+            </w:r>
+          </w:p>
+        </w:tc>
+        <w:tc>
+          <w:tcPr>
+            <w:tcW w:type="dxa" w:w="2493"/>
+          </w:tcPr>
+          <w:p>
+            <w:r>
+              <w:rPr>
+                <w:sz w:val="18"/>
+              </w:rPr>
+            </w:r>
+            <w:r>
+              <w:rPr>
+                <w:sz w:val="18"/>
+              </w:rPr>
+              <w:t>是；入口选择 + 表头核对</w:t>
+            </w:r>
+          </w:p>
+        </w:tc>
+        <w:tc>
+          <w:tcPr>
+            <w:tcW w:type="dxa" w:w="2493"/>
+          </w:tcPr>
+          <w:p>
+            <w:r>
+              <w:rPr>
+                <w:sz w:val="18"/>
+              </w:rPr>
+            </w:r>
+          </w:p>
+        </w:tc>
+      </w:tr>
+      <w:tr>
+        <w:tc>
+          <w:tcPr>
+            <w:tcW w:type="dxa" w:w="2493"/>
+          </w:tcPr>
+          <w:p>
+            <w:r>
+              <w:rPr>
+                <w:sz w:val="18"/>
+              </w:rPr>
+            </w:r>
+            <w:r>
+              <w:rPr>
+                <w:sz w:val="18"/>
+              </w:rPr>
+              <w:t>C3</w:t>
+            </w:r>
+          </w:p>
+        </w:tc>
+        <w:tc>
+          <w:tcPr>
+            <w:tcW w:type="dxa" w:w="2493"/>
+          </w:tcPr>
+          <w:p>
+            <w:r>
+              <w:rPr>
+                <w:sz w:val="18"/>
+              </w:rPr>
+            </w:r>
+            <w:r>
+              <w:rPr>
+                <w:sz w:val="18"/>
+              </w:rPr>
+              <w:t>管理员本人执行的拉活按多少计算，是否只作为内部业绩</w:t>
+            </w:r>
+          </w:p>
+        </w:tc>
+        <w:tc>
+          <w:tcPr>
+            <w:tcW w:type="dxa" w:w="2493"/>
+          </w:tcPr>
+          <w:p>
+            <w:r>
+              <w:rPr>
+                <w:sz w:val="18"/>
+              </w:rPr>
+            </w:r>
+            <w:r>
+              <w:rPr>
+                <w:sz w:val="18"/>
+              </w:rPr>
+              <w:t>2.00 元，只计入管理员业绩（与财务方案事项 5 一致）</w:t>
+            </w:r>
+          </w:p>
+        </w:tc>
+        <w:tc>
+          <w:tcPr>
+            <w:tcW w:type="dxa" w:w="2493"/>
+          </w:tcPr>
+          <w:p>
+            <w:r>
+              <w:rPr>
+                <w:sz w:val="18"/>
+              </w:rPr>
+            </w:r>
+          </w:p>
+        </w:tc>
+      </w:tr>
+      <w:tr>
+        <w:tc>
+          <w:tcPr>
+            <w:tcW w:type="dxa" w:w="2493"/>
+          </w:tcPr>
+          <w:p>
+            <w:r>
+              <w:rPr>
+                <w:sz w:val="18"/>
+              </w:rPr>
+            </w:r>
+            <w:r>
+              <w:rPr>
+                <w:sz w:val="18"/>
+              </w:rPr>
+              <w:t>C4</w:t>
+            </w:r>
+          </w:p>
+        </w:tc>
+        <w:tc>
+          <w:tcPr>
+            <w:tcW w:type="dxa" w:w="2493"/>
+          </w:tcPr>
+          <w:p>
+            <w:r>
+              <w:rPr>
+                <w:sz w:val="18"/>
+              </w:rPr>
+            </w:r>
+            <w:r>
+              <w:rPr>
+                <w:sz w:val="18"/>
+              </w:rPr>
+              <w:t>独立达人的拉活单价</w:t>
+            </w:r>
+          </w:p>
+        </w:tc>
+        <w:tc>
+          <w:tcPr>
+            <w:tcW w:type="dxa" w:w="2493"/>
+          </w:tcPr>
+          <w:p>
+            <w:r>
+              <w:rPr>
+                <w:sz w:val="18"/>
+              </w:rPr>
+            </w:r>
+            <w:r>
+              <w:rPr>
+                <w:sz w:val="18"/>
+              </w:rPr>
+              <w:t>与团队达人相同，1.20 元</w:t>
+            </w:r>
+          </w:p>
+        </w:tc>
+        <w:tc>
+          <w:tcPr>
+            <w:tcW w:type="dxa" w:w="2493"/>
+          </w:tcPr>
+          <w:p>
+            <w:r>
+              <w:rPr>
+                <w:sz w:val="18"/>
+              </w:rPr>
+            </w:r>
+          </w:p>
+        </w:tc>
+      </w:tr>
+      <w:tr>
+        <w:tc>
+          <w:tcPr>
+            <w:tcW w:type="dxa" w:w="2493"/>
+          </w:tcPr>
+          <w:p>
+            <w:r>
+              <w:rPr>
+                <w:sz w:val="18"/>
+              </w:rPr>
+            </w:r>
+            <w:r>
+              <w:rPr>
+                <w:sz w:val="18"/>
+              </w:rPr>
+              <w:t>C5</w:t>
+            </w:r>
+          </w:p>
+        </w:tc>
+        <w:tc>
+          <w:tcPr>
+            <w:tcW w:type="dxa" w:w="2493"/>
+          </w:tcPr>
+          <w:p>
+            <w:r>
+              <w:rPr>
+                <w:sz w:val="18"/>
+              </w:rPr>
+            </w:r>
+            <w:r>
+              <w:rPr>
+                <w:sz w:val="18"/>
+              </w:rPr>
+              <w:t>拉活单价从哪天开始生效</w:t>
+            </w:r>
+          </w:p>
+        </w:tc>
+        <w:tc>
+          <w:tcPr>
+            <w:tcW w:type="dxa" w:w="2493"/>
+          </w:tcPr>
+          <w:p>
+            <w:r>
+              <w:rPr>
+                <w:sz w:val="18"/>
+              </w:rPr>
+            </w:r>
+            <w:r>
+              <w:rPr>
+                <w:sz w:val="18"/>
+              </w:rPr>
+              <w:t>从第一份拉活表的日期开始</w:t>
+            </w:r>
+          </w:p>
+        </w:tc>
+        <w:tc>
+          <w:tcPr>
+            <w:tcW w:type="dxa" w:w="2493"/>
+          </w:tcPr>
+          <w:p>
+            <w:r>
+              <w:rPr>
+                <w:sz w:val="18"/>
+              </w:rPr>
+            </w:r>
+          </w:p>
+        </w:tc>
+      </w:tr>
+      <w:tr>
+        <w:tc>
+          <w:tcPr>
+            <w:tcW w:type="dxa" w:w="2493"/>
+          </w:tcPr>
+          <w:p>
+            <w:r>
+              <w:rPr>
+                <w:sz w:val="18"/>
+              </w:rPr>
+            </w:r>
+            <w:r>
+              <w:rPr>
+                <w:sz w:val="18"/>
+              </w:rPr>
+              <w:t>C6</w:t>
+            </w:r>
+          </w:p>
+        </w:tc>
+        <w:tc>
+          <w:tcPr>
+            <w:tcW w:type="dxa" w:w="2493"/>
+          </w:tcPr>
+          <w:p>
+            <w:r>
+              <w:rPr>
+                <w:sz w:val="18"/>
+              </w:rPr>
+            </w:r>
+            <w:r>
+              <w:rPr>
+                <w:sz w:val="18"/>
+              </w:rPr>
+              <w:t>拉活是否也要求作品核验通过才能确认</w:t>
+            </w:r>
+          </w:p>
+        </w:tc>
+        <w:tc>
+          <w:tcPr>
+            <w:tcW w:type="dxa" w:w="2493"/>
+          </w:tcPr>
+          <w:p>
+            <w:r>
+              <w:rPr>
+                <w:sz w:val="18"/>
+              </w:rPr>
+            </w:r>
+            <w:r>
+              <w:rPr>
+                <w:sz w:val="18"/>
+              </w:rPr>
+              <w:t>是，与拉新一致</w:t>
+            </w:r>
+          </w:p>
+        </w:tc>
+        <w:tc>
+          <w:tcPr>
+            <w:tcW w:type="dxa" w:w="2493"/>
+          </w:tcPr>
+          <w:p>
+            <w:r>
+              <w:rPr>
+                <w:sz w:val="18"/>
+              </w:rPr>
+            </w:r>
+          </w:p>
+        </w:tc>
+      </w:tr>
+      <w:tr>
+        <w:tc>
+          <w:tcPr>
+            <w:tcW w:type="dxa" w:w="2493"/>
+          </w:tcPr>
+          <w:p>
+            <w:r>
+              <w:rPr>
+                <w:sz w:val="18"/>
+              </w:rPr>
+            </w:r>
+            <w:r>
+              <w:rPr>
+                <w:sz w:val="18"/>
+              </w:rPr>
+              <w:t>C7</w:t>
+            </w:r>
+          </w:p>
+        </w:tc>
+        <w:tc>
+          <w:tcPr>
+            <w:tcW w:type="dxa" w:w="2493"/>
+          </w:tcPr>
+          <w:p>
+            <w:r>
+              <w:rPr>
+                <w:sz w:val="18"/>
+              </w:rPr>
+            </w:r>
+            <w:r>
+              <w:rPr>
+                <w:sz w:val="18"/>
+              </w:rPr>
+              <w:t>起量期补贴中的“日均订单环比”看哪类订单</w:t>
+            </w:r>
+          </w:p>
+        </w:tc>
+        <w:tc>
+          <w:tcPr>
+            <w:tcW w:type="dxa" w:w="2493"/>
+          </w:tcPr>
+          <w:p>
+            <w:r>
+              <w:rPr>
+                <w:sz w:val="18"/>
+              </w:rPr>
+            </w:r>
+            <w:r>
+              <w:rPr>
+                <w:sz w:val="18"/>
+              </w:rPr>
+              <w:t>待业务确认</w:t>
+            </w:r>
+          </w:p>
+        </w:tc>
+        <w:tc>
+          <w:tcPr>
+            <w:tcW w:type="dxa" w:w="2493"/>
+          </w:tcPr>
+          <w:p>
+            <w:r>
+              <w:rPr>
+                <w:sz w:val="18"/>
+              </w:rPr>
+            </w:r>
+          </w:p>
+        </w:tc>
+      </w:tr>
+      <w:tr>
+        <w:tc>
+          <w:tcPr>
+            <w:tcW w:type="dxa" w:w="2493"/>
+          </w:tcPr>
+          <w:p>
+            <w:r>
+              <w:rPr>
+                <w:sz w:val="18"/>
+              </w:rPr>
+            </w:r>
+            <w:r>
+              <w:rPr>
+                <w:sz w:val="18"/>
+              </w:rPr>
+              <w:t>C8</w:t>
+            </w:r>
+          </w:p>
+        </w:tc>
+        <w:tc>
+          <w:tcPr>
+            <w:tcW w:type="dxa" w:w="2493"/>
+          </w:tcPr>
+          <w:p>
+            <w:r>
+              <w:rPr>
+                <w:sz w:val="18"/>
+              </w:rPr>
+            </w:r>
+            <w:r>
+              <w:rPr>
+                <w:sz w:val="18"/>
+              </w:rPr>
+              <w:t>起量期补贴是否分给团长和达人，怎么分</w:t>
+            </w:r>
+          </w:p>
+        </w:tc>
+        <w:tc>
+          <w:tcPr>
+            <w:tcW w:type="dxa" w:w="2493"/>
+          </w:tcPr>
+          <w:p>
+            <w:r>
+              <w:rPr>
+                <w:sz w:val="18"/>
+              </w:rPr>
+            </w:r>
+            <w:r>
+              <w:rPr>
+                <w:sz w:val="18"/>
+              </w:rPr>
+              <w:t>待业务确认；本期只预留</w:t>
+            </w:r>
+          </w:p>
+        </w:tc>
+        <w:tc>
+          <w:tcPr>
+            <w:tcW w:type="dxa" w:w="2493"/>
+          </w:tcPr>
+          <w:p>
+            <w:r>
+              <w:rPr>
+                <w:sz w:val="18"/>
+              </w:rPr>
+            </w:r>
+          </w:p>
+        </w:tc>
+      </w:tr>
+      <w:tr>
+        <w:tc>
+          <w:tcPr>
+            <w:tcW w:type="dxa" w:w="2493"/>
+          </w:tcPr>
+          <w:p>
+            <w:r>
+              <w:rPr>
+                <w:sz w:val="18"/>
+              </w:rPr>
+            </w:r>
+            <w:r>
+              <w:rPr>
+                <w:sz w:val="18"/>
+              </w:rPr>
+              <w:t>C9</w:t>
+            </w:r>
+          </w:p>
+        </w:tc>
+        <w:tc>
+          <w:tcPr>
+            <w:tcW w:type="dxa" w:w="2493"/>
+          </w:tcPr>
+          <w:p>
+            <w:r>
+              <w:rPr>
+                <w:sz w:val="18"/>
+              </w:rPr>
+            </w:r>
+            <w:r>
+              <w:rPr>
+                <w:sz w:val="18"/>
+              </w:rPr>
+              <w:t>拉活的红线判定从哪里获得</w:t>
+            </w:r>
+          </w:p>
+        </w:tc>
+        <w:tc>
+          <w:tcPr>
+            <w:tcW w:type="dxa" w:w="2493"/>
+          </w:tcPr>
+          <w:p>
+            <w:r>
+              <w:rPr>
+                <w:sz w:val="18"/>
+              </w:rPr>
+            </w:r>
+            <w:r>
+              <w:rPr>
+                <w:sz w:val="18"/>
+              </w:rPr>
+              <w:t>待业务确认</w:t>
+            </w:r>
+          </w:p>
+        </w:tc>
+        <w:tc>
+          <w:tcPr>
+            <w:tcW w:type="dxa" w:w="2493"/>
+          </w:tcPr>
+          <w:p>
+            <w:r>
+              <w:rPr>
+                <w:sz w:val="18"/>
+              </w:rPr>
+            </w:r>
+          </w:p>
+        </w:tc>
+      </w:tr>
+      <w:tr>
+        <w:tc>
+          <w:tcPr>
+            <w:tcW w:type="dxa" w:w="2493"/>
+          </w:tcPr>
+          <w:p>
+            <w:r>
+              <w:rPr>
+                <w:sz w:val="18"/>
+              </w:rPr>
+            </w:r>
+            <w:r>
+              <w:rPr>
+                <w:sz w:val="18"/>
+              </w:rPr>
+              <w:t>C10</w:t>
+            </w:r>
+          </w:p>
+        </w:tc>
+        <w:tc>
+          <w:tcPr>
+            <w:tcW w:type="dxa" w:w="2493"/>
+          </w:tcPr>
+          <w:p>
+            <w:r>
+              <w:rPr>
+                <w:sz w:val="18"/>
+              </w:rPr>
+            </w:r>
+            <w:r>
+              <w:rPr>
+                <w:sz w:val="18"/>
+              </w:rPr>
+              <w:t>结算金额与“拉活量 × 2”不一致时以哪个为准</w:t>
+            </w:r>
+          </w:p>
+        </w:tc>
+        <w:tc>
+          <w:tcPr>
+            <w:tcW w:type="dxa" w:w="2493"/>
+          </w:tcPr>
+          <w:p>
+            <w:r>
+              <w:rPr>
+                <w:sz w:val="18"/>
+              </w:rPr>
+            </w:r>
+            <w:r>
+              <w:rPr>
+                <w:sz w:val="18"/>
+              </w:rPr>
+              <w:t>以拉活量 × 单价计算，差异提示财务核对</w:t>
             </w:r>
           </w:p>
         </w:tc>

</xml_diff>